<commit_message>
Changes at the Word for the Documentation
</commit_message>
<xml_diff>
--- a/documentation/IPS_PLANTILLA.docx
+++ b/documentation/IPS_PLANTILLA.docx
@@ -1,6 +1,6 @@
 
 <file path=word/document.xml><?xml version="1.0" encoding="utf-8"?>
-<w:document xmlns:wpc="http://schemas.microsoft.com/office/word/2010/wordprocessingCanvas" xmlns:cx="http://schemas.microsoft.com/office/drawing/2014/chartex" xmlns:cx1="http://schemas.microsoft.com/office/drawing/2015/9/8/chartex" xmlns:mc="http://schemas.openxmlformats.org/markup-compatibility/2006" xmlns:o="urn:schemas-microsoft-com:office:office" xmlns:r="http://schemas.openxmlformats.org/officeDocument/2006/relationships" xmlns:m="http://schemas.openxmlformats.org/officeDocument/2006/math" xmlns:v="urn:schemas-microsoft-com:vml" xmlns:wp14="http://schemas.microsoft.com/office/word/2010/wordprocessingDrawing" xmlns:wp="http://schemas.openxmlformats.org/drawingml/2006/wordprocessingDrawing" xmlns:w10="urn:schemas-microsoft-com:office:word" xmlns:w="http://schemas.openxmlformats.org/wordprocessingml/2006/main" xmlns:w14="http://schemas.microsoft.com/office/word/2010/wordml" xmlns:w15="http://schemas.microsoft.com/office/word/2012/wordml" xmlns:w16se="http://schemas.microsoft.com/office/word/2015/wordml/symex" xmlns:wpg="http://schemas.microsoft.com/office/word/2010/wordprocessingGroup" xmlns:wpi="http://schemas.microsoft.com/office/word/2010/wordprocessingInk" xmlns:wne="http://schemas.microsoft.com/office/word/2006/wordml" xmlns:wps="http://schemas.microsoft.com/office/word/2010/wordprocessingShape" mc:Ignorable="w14 w15 w16se wp14">
+<w:document xmlns:wpc="http://schemas.microsoft.com/office/word/2010/wordprocessingCanvas" xmlns:cx="http://schemas.microsoft.com/office/drawing/2014/chartex" xmlns:cx1="http://schemas.microsoft.com/office/drawing/2015/9/8/chartex" xmlns:cx2="http://schemas.microsoft.com/office/drawing/2015/10/21/chartex" xmlns:cx3="http://schemas.microsoft.com/office/drawing/2016/5/9/chartex" xmlns:cx4="http://schemas.microsoft.com/office/drawing/2016/5/10/chartex" xmlns:cx5="http://schemas.microsoft.com/office/drawing/2016/5/11/chartex" xmlns:cx6="http://schemas.microsoft.com/office/drawing/2016/5/12/chartex" xmlns:cx7="http://schemas.microsoft.com/office/drawing/2016/5/13/chartex" xmlns:cx8="http://schemas.microsoft.com/office/drawing/2016/5/14/chartex" xmlns:mc="http://schemas.openxmlformats.org/markup-compatibility/2006" xmlns:aink="http://schemas.microsoft.com/office/drawing/2016/ink" xmlns:am3d="http://schemas.microsoft.com/office/drawing/2017/model3d" xmlns:o="urn:schemas-microsoft-com:office:office" xmlns:oel="http://schemas.microsoft.com/office/2019/extlst" xmlns:r="http://schemas.openxmlformats.org/officeDocument/2006/relationships" xmlns:m="http://schemas.openxmlformats.org/officeDocument/2006/math" xmlns:v="urn:schemas-microsoft-com:vml" xmlns:wp14="http://schemas.microsoft.com/office/word/2010/wordprocessingDrawing" xmlns:wp="http://schemas.openxmlformats.org/drawingml/2006/wordprocessingDrawing" xmlns:w10="urn:schemas-microsoft-com:office:word" xmlns:w="http://schemas.openxmlformats.org/wordprocessingml/2006/main" xmlns:w14="http://schemas.microsoft.com/office/word/2010/wordml" xmlns:w15="http://schemas.microsoft.com/office/word/2012/wordml" xmlns:w16cex="http://schemas.microsoft.com/office/word/2018/wordml/cex" xmlns:w16cid="http://schemas.microsoft.com/office/word/2016/wordml/cid" xmlns:w16="http://schemas.microsoft.com/office/word/2018/wordml" xmlns:w16du="http://schemas.microsoft.com/office/word/2023/wordml/word16du" xmlns:w16sdtdh="http://schemas.microsoft.com/office/word/2020/wordml/sdtdatahash" xmlns:w16sdtfl="http://schemas.microsoft.com/office/word/2024/wordml/sdtformatlock" xmlns:w16se="http://schemas.microsoft.com/office/word/2015/wordml/symex" xmlns:wpg="http://schemas.microsoft.com/office/word/2010/wordprocessingGroup" xmlns:wpi="http://schemas.microsoft.com/office/word/2010/wordprocessingInk" xmlns:wne="http://schemas.microsoft.com/office/word/2006/wordml" xmlns:wps="http://schemas.microsoft.com/office/word/2010/wordprocessingShape" mc:Ignorable="w14 w15 w16se w16cid w16 w16cex w16sdtdh w16sdtfl w16du wp14">
   <w:body>
     <w:tbl>
       <w:tblPr>
@@ -688,7 +688,7 @@
           </mc:Choice>
           <mc:Fallback>
             <w:pict>
-              <v:group w14:anchorId="22D30FB4" id="Grupo 7" o:spid="_x0000_s1026" style="position:absolute;margin-left:.45pt;margin-top:94.9pt;width:422.95pt;height:197.25pt;z-index:251657216;mso-position-horizontal-relative:margin;mso-width-relative:margin;mso-height-relative:margin" coordorigin="76,-236" coordsize="53712,20950" o:gfxdata="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">
+              <v:group w14:anchorId="22D30FB4" id="Grupo 7" o:spid="_x0000_s1026" style="position:absolute;margin-left:.45pt;margin-top:94.9pt;width:422.95pt;height:197.25pt;z-index:251657216;mso-position-horizontal-relative:margin;mso-width-relative:margin;mso-height-relative:margin" coordorigin="76,-236" coordsize="53712,20950" o:gfxdata="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">
                 <v:shapetype id="_x0000_t202" coordsize="21600,21600" o:spt="202" path="m,l,21600r21600,l21600,xe">
                   <v:stroke joinstyle="miter"/>
                   <v:path gradientshapeok="t" o:connecttype="rect"/>
@@ -833,7 +833,7 @@
           <w:lang w:eastAsia="es-ES"/>
         </w:rPr>
         <w:drawing>
-          <wp:anchor distT="0" distB="0" distL="114300" distR="114300" simplePos="0" relativeHeight="251662336" behindDoc="0" locked="0" layoutInCell="1" allowOverlap="1" wp14:anchorId="25B6BA17" wp14:editId="243508DF">
+          <wp:anchor distT="0" distB="0" distL="114300" distR="114300" simplePos="0" relativeHeight="251662336" behindDoc="0" locked="0" layoutInCell="1" allowOverlap="1" wp14:anchorId="25B6BA17" wp14:editId="29902F20">
             <wp:simplePos x="0" y="0"/>
             <wp:positionH relativeFrom="rightMargin">
               <wp:posOffset>-6051681</wp:posOffset>
@@ -952,7 +952,13 @@
                               <w:jc w:val="center"/>
                             </w:pPr>
                             <w:r>
-                              <w:t>Curso 202</w:t>
+                              <w:t>C</w:t>
+                            </w:r>
+                            <w:r>
+                              <w:t>ourse</w:t>
+                            </w:r>
+                            <w:r>
+                              <w:t xml:space="preserve"> 202</w:t>
                             </w:r>
                             <w:r>
                               <w:t>6</w:t>
@@ -983,7 +989,7 @@
           </mc:Choice>
           <mc:Fallback>
             <w:pict>
-              <v:shape w14:anchorId="1E0FBC6A" id="Cuadro de texto 2" o:spid="_x0000_s1035" type="#_x0000_t202" style="position:absolute;margin-left:373.1pt;margin-top:668.35pt;width:424.3pt;height:110.6pt;z-index:251660288;visibility:visible;mso-wrap-style:square;mso-width-percent:0;mso-height-percent:200;mso-wrap-distance-left:9pt;mso-wrap-distance-top:3.6pt;mso-wrap-distance-right:9pt;mso-wrap-distance-bottom:3.6pt;mso-position-horizontal:right;mso-position-horizontal-relative:margin;mso-position-vertical:absolute;mso-position-vertical-relative:text;mso-width-percent:0;mso-height-percent:200;mso-width-relative:margin;mso-height-relative:margin;v-text-anchor:middle" o:gfxdata="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" filled="f" stroked="f">
+              <v:shape w14:anchorId="1E0FBC6A" id="Cuadro de texto 2" o:spid="_x0000_s1035" type="#_x0000_t202" style="position:absolute;margin-left:373.1pt;margin-top:668.35pt;width:424.3pt;height:110.6pt;z-index:251660288;visibility:visible;mso-wrap-style:square;mso-width-percent:0;mso-height-percent:200;mso-wrap-distance-left:9pt;mso-wrap-distance-top:3.6pt;mso-wrap-distance-right:9pt;mso-wrap-distance-bottom:3.6pt;mso-position-horizontal:right;mso-position-horizontal-relative:margin;mso-position-vertical:absolute;mso-position-vertical-relative:text;mso-width-percent:0;mso-height-percent:200;mso-width-relative:margin;mso-height-relative:margin;v-text-anchor:middle" o:gfxdata="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" filled="f" stroked="f">
                 <v:textbox style="mso-fit-shape-to-text:t">
                   <w:txbxContent>
                     <w:p>
@@ -991,7 +997,13 @@
                         <w:jc w:val="center"/>
                       </w:pPr>
                       <w:r>
-                        <w:t>Curso 202</w:t>
+                        <w:t>C</w:t>
+                      </w:r>
+                      <w:r>
+                        <w:t>ourse</w:t>
+                      </w:r>
+                      <w:r>
+                        <w:t xml:space="preserve"> 202</w:t>
                       </w:r>
                       <w:r>
                         <w:t>6</w:t>
@@ -1019,7 +1031,7 @@
           <w:lang w:eastAsia="es-ES"/>
         </w:rPr>
         <w:drawing>
-          <wp:anchor distT="0" distB="0" distL="114300" distR="114300" simplePos="0" relativeHeight="251659264" behindDoc="0" locked="0" layoutInCell="1" allowOverlap="1" wp14:anchorId="303242B3" wp14:editId="3BCCBEE7">
+          <wp:anchor distT="0" distB="0" distL="114300" distR="114300" simplePos="0" relativeHeight="251659264" behindDoc="0" locked="0" layoutInCell="1" allowOverlap="1" wp14:anchorId="303242B3" wp14:editId="04ED9595">
             <wp:simplePos x="0" y="0"/>
             <wp:positionH relativeFrom="rightMargin">
               <wp:posOffset>184416</wp:posOffset>
@@ -1182,7 +1194,7 @@
           </mc:Choice>
           <mc:Fallback>
             <w:pict>
-              <v:shape w14:anchorId="0CDF1DDC" id="Cuadro de texto 1" o:spid="_x0000_s1036" type="#_x0000_t202" style="position:absolute;margin-left:0;margin-top:424.6pt;width:225.2pt;height:47pt;z-index:251658240;visibility:visible;mso-wrap-style:none;mso-wrap-distance-left:9pt;mso-wrap-distance-top:0;mso-wrap-distance-right:9pt;mso-wrap-distance-bottom:0;mso-position-horizontal:center;mso-position-horizontal-relative:margin;mso-position-vertical:absolute;mso-position-vertical-relative:text;v-text-anchor:top" o:gfxdata="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" filled="f" stroked="f">
+              <v:shape w14:anchorId="0CDF1DDC" id="Cuadro de texto 1" o:spid="_x0000_s1036" type="#_x0000_t202" style="position:absolute;margin-left:0;margin-top:424.6pt;width:225.2pt;height:47pt;z-index:251658240;visibility:visible;mso-wrap-style:none;mso-wrap-distance-left:9pt;mso-wrap-distance-top:0;mso-wrap-distance-right:9pt;mso-wrap-distance-bottom:0;mso-position-horizontal:center;mso-position-horizontal-relative:margin;mso-position-vertical:absolute;mso-position-vertical-relative:text;v-text-anchor:top" o:gfxdata="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" filled="f" stroked="f">
                 <v:textbox style="mso-fit-shape-to-text:t">
                   <w:txbxContent>
                     <w:p>
@@ -2163,8 +2175,6 @@
         </w:rPr>
         <w:br w:type="page"/>
       </w:r>
-      <w:bookmarkStart w:id="1" w:name="_GoBack"/>
-      <w:bookmarkEnd w:id="1"/>
     </w:p>
     <w:p>
       <w:pPr>
@@ -2173,10 +2183,25 @@
           <w:bottom w:val="single" w:sz="4" w:space="4" w:color="auto"/>
         </w:pBdr>
       </w:pPr>
-      <w:bookmarkStart w:id="2" w:name="_Toc240364220"/>
+      <w:bookmarkStart w:id="1" w:name="_Toc240364220"/>
       <w:r>
         <w:lastRenderedPageBreak/>
         <w:t>System’s description</w:t>
+      </w:r>
+      <w:bookmarkEnd w:id="1"/>
+    </w:p>
+    <w:p/>
+    <w:p/>
+    <w:p>
+      <w:pPr>
+        <w:pStyle w:val="Ttulo1"/>
+        <w:pBdr>
+          <w:bottom w:val="single" w:sz="4" w:space="1" w:color="auto"/>
+        </w:pBdr>
+      </w:pPr>
+      <w:bookmarkStart w:id="2" w:name="_Toc240364221"/>
+      <w:r>
+        <w:t>user roles</w:t>
       </w:r>
       <w:bookmarkEnd w:id="2"/>
     </w:p>
@@ -2189,9 +2214,9 @@
           <w:bottom w:val="single" w:sz="4" w:space="1" w:color="auto"/>
         </w:pBdr>
       </w:pPr>
-      <w:bookmarkStart w:id="3" w:name="_Toc240364221"/>
+      <w:bookmarkStart w:id="3" w:name="_Toc240364222"/>
       <w:r>
-        <w:t>user roles</w:t>
+        <w:t>Technological environment</w:t>
       </w:r>
       <w:bookmarkEnd w:id="3"/>
     </w:p>
@@ -2204,9 +2229,9 @@
           <w:bottom w:val="single" w:sz="4" w:space="1" w:color="auto"/>
         </w:pBdr>
       </w:pPr>
-      <w:bookmarkStart w:id="4" w:name="_Toc240364222"/>
+      <w:bookmarkStart w:id="4" w:name="_Toc240364223"/>
       <w:r>
-        <w:t>Technological environment</w:t>
+        <w:t>Story mapping</w:t>
       </w:r>
       <w:bookmarkEnd w:id="4"/>
     </w:p>
@@ -2219,9 +2244,9 @@
           <w:bottom w:val="single" w:sz="4" w:space="1" w:color="auto"/>
         </w:pBdr>
       </w:pPr>
-      <w:bookmarkStart w:id="5" w:name="_Toc240364223"/>
+      <w:bookmarkStart w:id="5" w:name="_Toc240364224"/>
       <w:r>
-        <w:t>Story mapping</w:t>
+        <w:t>Data modelling</w:t>
       </w:r>
       <w:bookmarkEnd w:id="5"/>
     </w:p>
@@ -2234,14 +2259,21 @@
           <w:bottom w:val="single" w:sz="4" w:space="1" w:color="auto"/>
         </w:pBdr>
       </w:pPr>
-      <w:bookmarkStart w:id="6" w:name="_Toc240364224"/>
+      <w:bookmarkStart w:id="6" w:name="_Toc240364225"/>
       <w:r>
-        <w:t>Data modelling</w:t>
+        <w:t xml:space="preserve">User </w:t>
+      </w:r>
+      <w:proofErr w:type="gramStart"/>
+      <w:r>
+        <w:t>interface</w:t>
+      </w:r>
+      <w:proofErr w:type="gramEnd"/>
+      <w:r>
+        <w:t xml:space="preserve"> navigation map</w:t>
       </w:r>
       <w:bookmarkEnd w:id="6"/>
     </w:p>
     <w:p/>
-    <w:p/>
     <w:p>
       <w:pPr>
         <w:pStyle w:val="Ttulo1"/>
@@ -2249,31 +2281,11 @@
           <w:bottom w:val="single" w:sz="4" w:space="1" w:color="auto"/>
         </w:pBdr>
       </w:pPr>
-      <w:bookmarkStart w:id="7" w:name="_Toc240364225"/>
+      <w:bookmarkStart w:id="7" w:name="_Toc240364226"/>
       <w:r>
-        <w:t>User interface navigation map</w:t>
+        <w:t>Annex I: Screen prototypes</w:t>
       </w:r>
       <w:bookmarkEnd w:id="7"/>
-    </w:p>
-    <w:p/>
-    <w:p>
-      <w:pPr>
-        <w:pStyle w:val="Ttulo1"/>
-        <w:pBdr>
-          <w:bottom w:val="single" w:sz="4" w:space="1" w:color="auto"/>
-        </w:pBdr>
-      </w:pPr>
-      <w:bookmarkStart w:id="8" w:name="_Toc240364226"/>
-      <w:r>
-        <w:t>Annex I:</w:t>
-      </w:r>
-      <w:r>
-        <w:t xml:space="preserve"> </w:t>
-      </w:r>
-      <w:r>
-        <w:t>Screen prototypes</w:t>
-      </w:r>
-      <w:bookmarkEnd w:id="8"/>
     </w:p>
     <w:p/>
     <w:p>
@@ -2286,14 +2298,14 @@
           <w:lang w:val="en-GB"/>
         </w:rPr>
       </w:pPr>
-      <w:bookmarkStart w:id="9" w:name="_Toc240364227"/>
+      <w:bookmarkStart w:id="8" w:name="_Toc240364227"/>
       <w:r>
         <w:rPr>
           <w:lang w:val="en-GB"/>
         </w:rPr>
         <w:t>Annex II: tasks performed by each member</w:t>
       </w:r>
-      <w:bookmarkEnd w:id="9"/>
+      <w:bookmarkEnd w:id="8"/>
     </w:p>
     <w:sectPr>
       <w:pgSz w:w="11906" w:h="16838"/>
@@ -2307,7 +2319,7 @@
 </file>
 
 <file path=word/endnotes.xml><?xml version="1.0" encoding="utf-8"?>
-<w:endnotes xmlns:wpc="http://schemas.microsoft.com/office/word/2010/wordprocessingCanvas" xmlns:cx="http://schemas.microsoft.com/office/drawing/2014/chartex" xmlns:cx1="http://schemas.microsoft.com/office/drawing/2015/9/8/chartex" xmlns:mc="http://schemas.openxmlformats.org/markup-compatibility/2006" xmlns:o="urn:schemas-microsoft-com:office:office" xmlns:r="http://schemas.openxmlformats.org/officeDocument/2006/relationships" xmlns:m="http://schemas.openxmlformats.org/officeDocument/2006/math" xmlns:v="urn:schemas-microsoft-com:vml" xmlns:wp14="http://schemas.microsoft.com/office/word/2010/wordprocessingDrawing" xmlns:wp="http://schemas.openxmlformats.org/drawingml/2006/wordprocessingDrawing" xmlns:w10="urn:schemas-microsoft-com:office:word" xmlns:w="http://schemas.openxmlformats.org/wordprocessingml/2006/main" xmlns:w14="http://schemas.microsoft.com/office/word/2010/wordml" xmlns:w15="http://schemas.microsoft.com/office/word/2012/wordml" xmlns:w16se="http://schemas.microsoft.com/office/word/2015/wordml/symex" xmlns:wpg="http://schemas.microsoft.com/office/word/2010/wordprocessingGroup" xmlns:wpi="http://schemas.microsoft.com/office/word/2010/wordprocessingInk" xmlns:wne="http://schemas.microsoft.com/office/word/2006/wordml" xmlns:wps="http://schemas.microsoft.com/office/word/2010/wordprocessingShape" mc:Ignorable="w14 w15 w16se wp14">
+<w:endnotes xmlns:wpc="http://schemas.microsoft.com/office/word/2010/wordprocessingCanvas" xmlns:cx="http://schemas.microsoft.com/office/drawing/2014/chartex" xmlns:cx1="http://schemas.microsoft.com/office/drawing/2015/9/8/chartex" xmlns:cx2="http://schemas.microsoft.com/office/drawing/2015/10/21/chartex" xmlns:cx3="http://schemas.microsoft.com/office/drawing/2016/5/9/chartex" xmlns:cx4="http://schemas.microsoft.com/office/drawing/2016/5/10/chartex" xmlns:cx5="http://schemas.microsoft.com/office/drawing/2016/5/11/chartex" xmlns:cx6="http://schemas.microsoft.com/office/drawing/2016/5/12/chartex" xmlns:cx7="http://schemas.microsoft.com/office/drawing/2016/5/13/chartex" xmlns:cx8="http://schemas.microsoft.com/office/drawing/2016/5/14/chartex" xmlns:mc="http://schemas.openxmlformats.org/markup-compatibility/2006" xmlns:aink="http://schemas.microsoft.com/office/drawing/2016/ink" xmlns:am3d="http://schemas.microsoft.com/office/drawing/2017/model3d" xmlns:o="urn:schemas-microsoft-com:office:office" xmlns:oel="http://schemas.microsoft.com/office/2019/extlst" xmlns:r="http://schemas.openxmlformats.org/officeDocument/2006/relationships" xmlns:m="http://schemas.openxmlformats.org/officeDocument/2006/math" xmlns:v="urn:schemas-microsoft-com:vml" xmlns:wp14="http://schemas.microsoft.com/office/word/2010/wordprocessingDrawing" xmlns:wp="http://schemas.openxmlformats.org/drawingml/2006/wordprocessingDrawing" xmlns:w10="urn:schemas-microsoft-com:office:word" xmlns:w="http://schemas.openxmlformats.org/wordprocessingml/2006/main" xmlns:w14="http://schemas.microsoft.com/office/word/2010/wordml" xmlns:w15="http://schemas.microsoft.com/office/word/2012/wordml" xmlns:w16cex="http://schemas.microsoft.com/office/word/2018/wordml/cex" xmlns:w16cid="http://schemas.microsoft.com/office/word/2016/wordml/cid" xmlns:w16="http://schemas.microsoft.com/office/word/2018/wordml" xmlns:w16du="http://schemas.microsoft.com/office/word/2023/wordml/word16du" xmlns:w16sdtdh="http://schemas.microsoft.com/office/word/2020/wordml/sdtdatahash" xmlns:w16sdtfl="http://schemas.microsoft.com/office/word/2024/wordml/sdtformatlock" xmlns:w16se="http://schemas.microsoft.com/office/word/2015/wordml/symex" xmlns:wpg="http://schemas.microsoft.com/office/word/2010/wordprocessingGroup" xmlns:wpi="http://schemas.microsoft.com/office/word/2010/wordprocessingInk" xmlns:wne="http://schemas.microsoft.com/office/word/2006/wordml" xmlns:wps="http://schemas.microsoft.com/office/word/2010/wordprocessingShape" mc:Ignorable="w14 w15 w16se w16cid w16 w16cex w16sdtdh w16sdtfl w16du wp14">
   <w:endnote w:type="separator" w:id="-1">
     <w:p>
       <w:pPr>
@@ -2332,7 +2344,7 @@
 </file>
 
 <file path=word/footer1.xml><?xml version="1.0" encoding="utf-8"?>
-<w:ftr xmlns:wpc="http://schemas.microsoft.com/office/word/2010/wordprocessingCanvas" xmlns:cx="http://schemas.microsoft.com/office/drawing/2014/chartex" xmlns:cx1="http://schemas.microsoft.com/office/drawing/2015/9/8/chartex" xmlns:mc="http://schemas.openxmlformats.org/markup-compatibility/2006" xmlns:o="urn:schemas-microsoft-com:office:office" xmlns:r="http://schemas.openxmlformats.org/officeDocument/2006/relationships" xmlns:m="http://schemas.openxmlformats.org/officeDocument/2006/math" xmlns:v="urn:schemas-microsoft-com:vml" xmlns:wp14="http://schemas.microsoft.com/office/word/2010/wordprocessingDrawing" xmlns:wp="http://schemas.openxmlformats.org/drawingml/2006/wordprocessingDrawing" xmlns:w10="urn:schemas-microsoft-com:office:word" xmlns:w="http://schemas.openxmlformats.org/wordprocessingml/2006/main" xmlns:w14="http://schemas.microsoft.com/office/word/2010/wordml" xmlns:w15="http://schemas.microsoft.com/office/word/2012/wordml" xmlns:w16se="http://schemas.microsoft.com/office/word/2015/wordml/symex" xmlns:wpg="http://schemas.microsoft.com/office/word/2010/wordprocessingGroup" xmlns:wpi="http://schemas.microsoft.com/office/word/2010/wordprocessingInk" xmlns:wne="http://schemas.microsoft.com/office/word/2006/wordml" xmlns:wps="http://schemas.microsoft.com/office/word/2010/wordprocessingShape" mc:Ignorable="w14 w15 w16se wp14">
+<w:ftr xmlns:wpc="http://schemas.microsoft.com/office/word/2010/wordprocessingCanvas" xmlns:cx="http://schemas.microsoft.com/office/drawing/2014/chartex" xmlns:cx1="http://schemas.microsoft.com/office/drawing/2015/9/8/chartex" xmlns:cx2="http://schemas.microsoft.com/office/drawing/2015/10/21/chartex" xmlns:cx3="http://schemas.microsoft.com/office/drawing/2016/5/9/chartex" xmlns:cx4="http://schemas.microsoft.com/office/drawing/2016/5/10/chartex" xmlns:cx5="http://schemas.microsoft.com/office/drawing/2016/5/11/chartex" xmlns:cx6="http://schemas.microsoft.com/office/drawing/2016/5/12/chartex" xmlns:cx7="http://schemas.microsoft.com/office/drawing/2016/5/13/chartex" xmlns:cx8="http://schemas.microsoft.com/office/drawing/2016/5/14/chartex" xmlns:mc="http://schemas.openxmlformats.org/markup-compatibility/2006" xmlns:aink="http://schemas.microsoft.com/office/drawing/2016/ink" xmlns:am3d="http://schemas.microsoft.com/office/drawing/2017/model3d" xmlns:o="urn:schemas-microsoft-com:office:office" xmlns:oel="http://schemas.microsoft.com/office/2019/extlst" xmlns:r="http://schemas.openxmlformats.org/officeDocument/2006/relationships" xmlns:m="http://schemas.openxmlformats.org/officeDocument/2006/math" xmlns:v="urn:schemas-microsoft-com:vml" xmlns:wp14="http://schemas.microsoft.com/office/word/2010/wordprocessingDrawing" xmlns:wp="http://schemas.openxmlformats.org/drawingml/2006/wordprocessingDrawing" xmlns:w10="urn:schemas-microsoft-com:office:word" xmlns:w="http://schemas.openxmlformats.org/wordprocessingml/2006/main" xmlns:w14="http://schemas.microsoft.com/office/word/2010/wordml" xmlns:w15="http://schemas.microsoft.com/office/word/2012/wordml" xmlns:w16cex="http://schemas.microsoft.com/office/word/2018/wordml/cex" xmlns:w16cid="http://schemas.microsoft.com/office/word/2016/wordml/cid" xmlns:w16="http://schemas.microsoft.com/office/word/2018/wordml" xmlns:w16du="http://schemas.microsoft.com/office/word/2023/wordml/word16du" xmlns:w16sdtdh="http://schemas.microsoft.com/office/word/2020/wordml/sdtdatahash" xmlns:w16sdtfl="http://schemas.microsoft.com/office/word/2024/wordml/sdtformatlock" xmlns:w16se="http://schemas.microsoft.com/office/word/2015/wordml/symex" xmlns:wpg="http://schemas.microsoft.com/office/word/2010/wordprocessingGroup" xmlns:wpi="http://schemas.microsoft.com/office/word/2010/wordprocessingInk" xmlns:wne="http://schemas.microsoft.com/office/word/2006/wordml" xmlns:wps="http://schemas.microsoft.com/office/word/2010/wordprocessingShape" mc:Ignorable="w14 w15 w16se w16cid w16 w16cex w16sdtdh w16sdtfl w16du wp14">
   <w:p>
     <w:pPr>
       <w:pStyle w:val="Piedepgina"/>
@@ -2346,7 +2358,6 @@
           <w:docPartUnique/>
         </w:docPartObj>
       </w:sdtPr>
-      <w:sdtEndPr/>
       <w:sdtContent>
         <w:r>
           <w:t>Page</w:t>
@@ -2396,7 +2407,7 @@
 </file>
 
 <file path=word/footnotes.xml><?xml version="1.0" encoding="utf-8"?>
-<w:footnotes xmlns:wpc="http://schemas.microsoft.com/office/word/2010/wordprocessingCanvas" xmlns:cx="http://schemas.microsoft.com/office/drawing/2014/chartex" xmlns:cx1="http://schemas.microsoft.com/office/drawing/2015/9/8/chartex" xmlns:mc="http://schemas.openxmlformats.org/markup-compatibility/2006" xmlns:o="urn:schemas-microsoft-com:office:office" xmlns:r="http://schemas.openxmlformats.org/officeDocument/2006/relationships" xmlns:m="http://schemas.openxmlformats.org/officeDocument/2006/math" xmlns:v="urn:schemas-microsoft-com:vml" xmlns:wp14="http://schemas.microsoft.com/office/word/2010/wordprocessingDrawing" xmlns:wp="http://schemas.openxmlformats.org/drawingml/2006/wordprocessingDrawing" xmlns:w10="urn:schemas-microsoft-com:office:word" xmlns:w="http://schemas.openxmlformats.org/wordprocessingml/2006/main" xmlns:w14="http://schemas.microsoft.com/office/word/2010/wordml" xmlns:w15="http://schemas.microsoft.com/office/word/2012/wordml" xmlns:w16se="http://schemas.microsoft.com/office/word/2015/wordml/symex" xmlns:wpg="http://schemas.microsoft.com/office/word/2010/wordprocessingGroup" xmlns:wpi="http://schemas.microsoft.com/office/word/2010/wordprocessingInk" xmlns:wne="http://schemas.microsoft.com/office/word/2006/wordml" xmlns:wps="http://schemas.microsoft.com/office/word/2010/wordprocessingShape" mc:Ignorable="w14 w15 w16se wp14">
+<w:footnotes xmlns:wpc="http://schemas.microsoft.com/office/word/2010/wordprocessingCanvas" xmlns:cx="http://schemas.microsoft.com/office/drawing/2014/chartex" xmlns:cx1="http://schemas.microsoft.com/office/drawing/2015/9/8/chartex" xmlns:cx2="http://schemas.microsoft.com/office/drawing/2015/10/21/chartex" xmlns:cx3="http://schemas.microsoft.com/office/drawing/2016/5/9/chartex" xmlns:cx4="http://schemas.microsoft.com/office/drawing/2016/5/10/chartex" xmlns:cx5="http://schemas.microsoft.com/office/drawing/2016/5/11/chartex" xmlns:cx6="http://schemas.microsoft.com/office/drawing/2016/5/12/chartex" xmlns:cx7="http://schemas.microsoft.com/office/drawing/2016/5/13/chartex" xmlns:cx8="http://schemas.microsoft.com/office/drawing/2016/5/14/chartex" xmlns:mc="http://schemas.openxmlformats.org/markup-compatibility/2006" xmlns:aink="http://schemas.microsoft.com/office/drawing/2016/ink" xmlns:am3d="http://schemas.microsoft.com/office/drawing/2017/model3d" xmlns:o="urn:schemas-microsoft-com:office:office" xmlns:oel="http://schemas.microsoft.com/office/2019/extlst" xmlns:r="http://schemas.openxmlformats.org/officeDocument/2006/relationships" xmlns:m="http://schemas.openxmlformats.org/officeDocument/2006/math" xmlns:v="urn:schemas-microsoft-com:vml" xmlns:wp14="http://schemas.microsoft.com/office/word/2010/wordprocessingDrawing" xmlns:wp="http://schemas.openxmlformats.org/drawingml/2006/wordprocessingDrawing" xmlns:w10="urn:schemas-microsoft-com:office:word" xmlns:w="http://schemas.openxmlformats.org/wordprocessingml/2006/main" xmlns:w14="http://schemas.microsoft.com/office/word/2010/wordml" xmlns:w15="http://schemas.microsoft.com/office/word/2012/wordml" xmlns:w16cex="http://schemas.microsoft.com/office/word/2018/wordml/cex" xmlns:w16cid="http://schemas.microsoft.com/office/word/2016/wordml/cid" xmlns:w16="http://schemas.microsoft.com/office/word/2018/wordml" xmlns:w16du="http://schemas.microsoft.com/office/word/2023/wordml/word16du" xmlns:w16sdtdh="http://schemas.microsoft.com/office/word/2020/wordml/sdtdatahash" xmlns:w16sdtfl="http://schemas.microsoft.com/office/word/2024/wordml/sdtformatlock" xmlns:w16se="http://schemas.microsoft.com/office/word/2015/wordml/symex" xmlns:wpg="http://schemas.microsoft.com/office/word/2010/wordprocessingGroup" xmlns:wpi="http://schemas.microsoft.com/office/word/2010/wordprocessingInk" xmlns:wne="http://schemas.microsoft.com/office/word/2006/wordml" xmlns:wps="http://schemas.microsoft.com/office/word/2010/wordprocessingShape" mc:Ignorable="w14 w15 w16se w16cid w16 w16cex w16sdtdh w16sdtfl w16du wp14">
   <w:footnote w:type="separator" w:id="-1">
     <w:p>
       <w:pPr>
@@ -2421,7 +2432,7 @@
 </file>
 
 <file path=word/header1.xml><?xml version="1.0" encoding="utf-8"?>
-<w:hdr xmlns:wpc="http://schemas.microsoft.com/office/word/2010/wordprocessingCanvas" xmlns:cx="http://schemas.microsoft.com/office/drawing/2014/chartex" xmlns:cx1="http://schemas.microsoft.com/office/drawing/2015/9/8/chartex" xmlns:mc="http://schemas.openxmlformats.org/markup-compatibility/2006" xmlns:o="urn:schemas-microsoft-com:office:office" xmlns:r="http://schemas.openxmlformats.org/officeDocument/2006/relationships" xmlns:m="http://schemas.openxmlformats.org/officeDocument/2006/math" xmlns:v="urn:schemas-microsoft-com:vml" xmlns:wp14="http://schemas.microsoft.com/office/word/2010/wordprocessingDrawing" xmlns:wp="http://schemas.openxmlformats.org/drawingml/2006/wordprocessingDrawing" xmlns:w10="urn:schemas-microsoft-com:office:word" xmlns:w="http://schemas.openxmlformats.org/wordprocessingml/2006/main" xmlns:w14="http://schemas.microsoft.com/office/word/2010/wordml" xmlns:w15="http://schemas.microsoft.com/office/word/2012/wordml" xmlns:w16se="http://schemas.microsoft.com/office/word/2015/wordml/symex" xmlns:wpg="http://schemas.microsoft.com/office/word/2010/wordprocessingGroup" xmlns:wpi="http://schemas.microsoft.com/office/word/2010/wordprocessingInk" xmlns:wne="http://schemas.microsoft.com/office/word/2006/wordml" xmlns:wps="http://schemas.microsoft.com/office/word/2010/wordprocessingShape" mc:Ignorable="w14 w15 w16se wp14">
+<w:hdr xmlns:wpc="http://schemas.microsoft.com/office/word/2010/wordprocessingCanvas" xmlns:cx="http://schemas.microsoft.com/office/drawing/2014/chartex" xmlns:cx1="http://schemas.microsoft.com/office/drawing/2015/9/8/chartex" xmlns:cx2="http://schemas.microsoft.com/office/drawing/2015/10/21/chartex" xmlns:cx3="http://schemas.microsoft.com/office/drawing/2016/5/9/chartex" xmlns:cx4="http://schemas.microsoft.com/office/drawing/2016/5/10/chartex" xmlns:cx5="http://schemas.microsoft.com/office/drawing/2016/5/11/chartex" xmlns:cx6="http://schemas.microsoft.com/office/drawing/2016/5/12/chartex" xmlns:cx7="http://schemas.microsoft.com/office/drawing/2016/5/13/chartex" xmlns:cx8="http://schemas.microsoft.com/office/drawing/2016/5/14/chartex" xmlns:mc="http://schemas.openxmlformats.org/markup-compatibility/2006" xmlns:aink="http://schemas.microsoft.com/office/drawing/2016/ink" xmlns:am3d="http://schemas.microsoft.com/office/drawing/2017/model3d" xmlns:o="urn:schemas-microsoft-com:office:office" xmlns:oel="http://schemas.microsoft.com/office/2019/extlst" xmlns:r="http://schemas.openxmlformats.org/officeDocument/2006/relationships" xmlns:m="http://schemas.openxmlformats.org/officeDocument/2006/math" xmlns:v="urn:schemas-microsoft-com:vml" xmlns:wp14="http://schemas.microsoft.com/office/word/2010/wordprocessingDrawing" xmlns:wp="http://schemas.openxmlformats.org/drawingml/2006/wordprocessingDrawing" xmlns:w10="urn:schemas-microsoft-com:office:word" xmlns:w="http://schemas.openxmlformats.org/wordprocessingml/2006/main" xmlns:w14="http://schemas.microsoft.com/office/word/2010/wordml" xmlns:w15="http://schemas.microsoft.com/office/word/2012/wordml" xmlns:w16cex="http://schemas.microsoft.com/office/word/2018/wordml/cex" xmlns:w16cid="http://schemas.microsoft.com/office/word/2016/wordml/cid" xmlns:w16="http://schemas.microsoft.com/office/word/2018/wordml" xmlns:w16du="http://schemas.microsoft.com/office/word/2023/wordml/word16du" xmlns:w16sdtdh="http://schemas.microsoft.com/office/word/2020/wordml/sdtdatahash" xmlns:w16sdtfl="http://schemas.microsoft.com/office/word/2024/wordml/sdtformatlock" xmlns:w16se="http://schemas.microsoft.com/office/word/2015/wordml/symex" xmlns:wpg="http://schemas.microsoft.com/office/word/2010/wordprocessingGroup" xmlns:wpi="http://schemas.microsoft.com/office/word/2010/wordprocessingInk" xmlns:wne="http://schemas.microsoft.com/office/word/2006/wordml" xmlns:wps="http://schemas.microsoft.com/office/word/2010/wordprocessingShape" mc:Ignorable="w14 w15 w16se w16cid w16 w16cex w16sdtdh w16sdtfl w16du wp14">
   <w:tbl>
     <w:tblPr>
       <w:tblStyle w:val="Tablaconcuadrcula"/>
@@ -2561,6 +2572,7 @@
               <w:szCs w:val="20"/>
             </w:rPr>
           </w:pPr>
+          <w:proofErr w:type="spellStart"/>
           <w:r>
             <w:rPr>
               <w:rFonts w:ascii="Georgia" w:hAnsi="Georgia"/>
@@ -2568,13 +2580,9 @@
               <w:sz w:val="20"/>
               <w:szCs w:val="20"/>
             </w:rPr>
-            <w:t>Universidá d’Uviéu</w:t>
+            <w:t>Universidá</w:t>
           </w:r>
-        </w:p>
-        <w:p>
-          <w:pPr>
-            <w:pStyle w:val="Encabezado"/>
-          </w:pPr>
+          <w:proofErr w:type="spellEnd"/>
           <w:r>
             <w:rPr>
               <w:rFonts w:ascii="Georgia" w:hAnsi="Georgia"/>
@@ -2582,14 +2590,59 @@
               <w:sz w:val="20"/>
               <w:szCs w:val="20"/>
             </w:rPr>
-            <w:t xml:space="preserve">University </w:t>
+            <w:t xml:space="preserve"> </w:t>
           </w:r>
+          <w:proofErr w:type="spellStart"/>
+          <w:r>
+            <w:rPr>
+              <w:rFonts w:ascii="Georgia" w:hAnsi="Georgia"/>
+              <w:color w:val="777777"/>
+              <w:sz w:val="20"/>
+              <w:szCs w:val="20"/>
+            </w:rPr>
+            <w:t>d’Uviéu</w:t>
+          </w:r>
+          <w:proofErr w:type="spellEnd"/>
+        </w:p>
+        <w:p>
+          <w:pPr>
+            <w:pStyle w:val="Encabezado"/>
+          </w:pPr>
+          <w:proofErr w:type="spellStart"/>
+          <w:r>
+            <w:rPr>
+              <w:rFonts w:ascii="Georgia" w:hAnsi="Georgia"/>
+              <w:color w:val="777777"/>
+              <w:sz w:val="20"/>
+              <w:szCs w:val="20"/>
+            </w:rPr>
+            <w:t>University</w:t>
+          </w:r>
+          <w:proofErr w:type="spellEnd"/>
+          <w:r>
+            <w:rPr>
+              <w:rFonts w:ascii="Georgia" w:hAnsi="Georgia"/>
+              <w:color w:val="777777"/>
+              <w:sz w:val="20"/>
+              <w:szCs w:val="20"/>
+            </w:rPr>
+            <w:t xml:space="preserve"> </w:t>
+          </w:r>
+          <w:proofErr w:type="spellStart"/>
           <w:r>
             <w:rPr>
               <w:rFonts w:ascii="Georgia" w:hAnsi="Georgia"/>
               <w:color w:val="777777"/>
             </w:rPr>
-            <w:t>of Oviedo</w:t>
+            <w:t>of</w:t>
+          </w:r>
+          <w:proofErr w:type="spellEnd"/>
+          <w:r>
+            <w:rPr>
+              <w:rFonts w:ascii="Georgia" w:hAnsi="Georgia"/>
+              <w:color w:val="777777"/>
+            </w:rPr>
+            <w:t xml:space="preserve"> Oviedo</w:t>
           </w:r>
         </w:p>
       </w:tc>
@@ -2704,6 +2757,48 @@
               <w:szCs w:val="20"/>
             </w:rPr>
             <w:t>Lago Martín, Patricia</w:t>
+          </w:r>
+        </w:p>
+        <w:p>
+          <w:pPr>
+            <w:pStyle w:val="Encabezado"/>
+            <w:jc w:val="right"/>
+            <w:rPr>
+              <w:rFonts w:ascii="Georgia" w:hAnsi="Georgia"/>
+              <w:color w:val="777777"/>
+              <w:sz w:val="12"/>
+              <w:szCs w:val="20"/>
+            </w:rPr>
+          </w:pPr>
+          <w:r>
+            <w:rPr>
+              <w:rFonts w:ascii="Georgia" w:hAnsi="Georgia"/>
+              <w:color w:val="777777"/>
+              <w:sz w:val="12"/>
+              <w:szCs w:val="20"/>
+            </w:rPr>
+            <w:t>García Suárez, Adriana</w:t>
+          </w:r>
+        </w:p>
+        <w:p>
+          <w:pPr>
+            <w:pStyle w:val="Encabezado"/>
+            <w:jc w:val="right"/>
+            <w:rPr>
+              <w:rFonts w:ascii="Georgia" w:hAnsi="Georgia"/>
+              <w:color w:val="777777"/>
+              <w:sz w:val="12"/>
+              <w:szCs w:val="20"/>
+            </w:rPr>
+          </w:pPr>
+          <w:r>
+            <w:rPr>
+              <w:rFonts w:ascii="Georgia" w:hAnsi="Georgia"/>
+              <w:color w:val="777777"/>
+              <w:sz w:val="12"/>
+              <w:szCs w:val="20"/>
+            </w:rPr>
+            <w:t>Reyero Espinedo, Daniel</w:t>
           </w:r>
         </w:p>
       </w:tc>
@@ -2954,7 +3049,7 @@
 </file>
 
 <file path=word/numbering.xml><?xml version="1.0" encoding="utf-8"?>
-<w:numbering xmlns:wpc="http://schemas.microsoft.com/office/word/2010/wordprocessingCanvas" xmlns:cx="http://schemas.microsoft.com/office/drawing/2014/chartex" xmlns:cx1="http://schemas.microsoft.com/office/drawing/2015/9/8/chartex" xmlns:mc="http://schemas.openxmlformats.org/markup-compatibility/2006" xmlns:o="urn:schemas-microsoft-com:office:office" xmlns:r="http://schemas.openxmlformats.org/officeDocument/2006/relationships" xmlns:m="http://schemas.openxmlformats.org/officeDocument/2006/math" xmlns:v="urn:schemas-microsoft-com:vml" xmlns:wp14="http://schemas.microsoft.com/office/word/2010/wordprocessingDrawing" xmlns:wp="http://schemas.openxmlformats.org/drawingml/2006/wordprocessingDrawing" xmlns:w10="urn:schemas-microsoft-com:office:word" xmlns:w="http://schemas.openxmlformats.org/wordprocessingml/2006/main" xmlns:w14="http://schemas.microsoft.com/office/word/2010/wordml" xmlns:w15="http://schemas.microsoft.com/office/word/2012/wordml" xmlns:w16se="http://schemas.microsoft.com/office/word/2015/wordml/symex" xmlns:wpg="http://schemas.microsoft.com/office/word/2010/wordprocessingGroup" xmlns:wpi="http://schemas.microsoft.com/office/word/2010/wordprocessingInk" xmlns:wne="http://schemas.microsoft.com/office/word/2006/wordml" xmlns:wps="http://schemas.microsoft.com/office/word/2010/wordprocessingShape" mc:Ignorable="w14 w15 w16se wp14">
+<w:numbering xmlns:wpc="http://schemas.microsoft.com/office/word/2010/wordprocessingCanvas" xmlns:cx="http://schemas.microsoft.com/office/drawing/2014/chartex" xmlns:cx1="http://schemas.microsoft.com/office/drawing/2015/9/8/chartex" xmlns:cx2="http://schemas.microsoft.com/office/drawing/2015/10/21/chartex" xmlns:cx3="http://schemas.microsoft.com/office/drawing/2016/5/9/chartex" xmlns:cx4="http://schemas.microsoft.com/office/drawing/2016/5/10/chartex" xmlns:cx5="http://schemas.microsoft.com/office/drawing/2016/5/11/chartex" xmlns:cx6="http://schemas.microsoft.com/office/drawing/2016/5/12/chartex" xmlns:cx7="http://schemas.microsoft.com/office/drawing/2016/5/13/chartex" xmlns:cx8="http://schemas.microsoft.com/office/drawing/2016/5/14/chartex" xmlns:mc="http://schemas.openxmlformats.org/markup-compatibility/2006" xmlns:aink="http://schemas.microsoft.com/office/drawing/2016/ink" xmlns:am3d="http://schemas.microsoft.com/office/drawing/2017/model3d" xmlns:o="urn:schemas-microsoft-com:office:office" xmlns:oel="http://schemas.microsoft.com/office/2019/extlst" xmlns:r="http://schemas.openxmlformats.org/officeDocument/2006/relationships" xmlns:m="http://schemas.openxmlformats.org/officeDocument/2006/math" xmlns:v="urn:schemas-microsoft-com:vml" xmlns:wp14="http://schemas.microsoft.com/office/word/2010/wordprocessingDrawing" xmlns:wp="http://schemas.openxmlformats.org/drawingml/2006/wordprocessingDrawing" xmlns:w10="urn:schemas-microsoft-com:office:word" xmlns:w="http://schemas.openxmlformats.org/wordprocessingml/2006/main" xmlns:w14="http://schemas.microsoft.com/office/word/2010/wordml" xmlns:w15="http://schemas.microsoft.com/office/word/2012/wordml" xmlns:w16cex="http://schemas.microsoft.com/office/word/2018/wordml/cex" xmlns:w16cid="http://schemas.microsoft.com/office/word/2016/wordml/cid" xmlns:w16="http://schemas.microsoft.com/office/word/2018/wordml" xmlns:w16du="http://schemas.microsoft.com/office/word/2023/wordml/word16du" xmlns:w16sdtdh="http://schemas.microsoft.com/office/word/2020/wordml/sdtdatahash" xmlns:w16sdtfl="http://schemas.microsoft.com/office/word/2024/wordml/sdtformatlock" xmlns:w16se="http://schemas.microsoft.com/office/word/2015/wordml/symex" xmlns:wpg="http://schemas.microsoft.com/office/word/2010/wordprocessingGroup" xmlns:wpi="http://schemas.microsoft.com/office/word/2010/wordprocessingInk" xmlns:wne="http://schemas.microsoft.com/office/word/2006/wordml" xmlns:wps="http://schemas.microsoft.com/office/word/2010/wordprocessingShape" mc:Ignorable="w14 w15 w16se w16cid w16 w16cex w16sdtdh w16sdtfl w16du wp14">
   <w:abstractNum w:abstractNumId="0" w15:restartNumberingAfterBreak="0">
     <w:nsid w:val="00321C26"/>
     <w:multiLevelType w:val="hybridMultilevel"/>
@@ -5126,104 +5221,104 @@
       </w:rPr>
     </w:lvl>
   </w:abstractNum>
-  <w:num w:numId="1">
+  <w:num w:numId="1" w16cid:durableId="176383376">
     <w:abstractNumId w:val="1"/>
   </w:num>
-  <w:num w:numId="2">
+  <w:num w:numId="2" w16cid:durableId="1333993684">
     <w:abstractNumId w:val="12"/>
   </w:num>
-  <w:num w:numId="3">
+  <w:num w:numId="3" w16cid:durableId="467551009">
     <w:abstractNumId w:val="12"/>
   </w:num>
-  <w:num w:numId="4">
+  <w:num w:numId="4" w16cid:durableId="1848330496">
     <w:abstractNumId w:val="7"/>
   </w:num>
-  <w:num w:numId="5">
+  <w:num w:numId="5" w16cid:durableId="1666466">
     <w:abstractNumId w:val="5"/>
   </w:num>
-  <w:num w:numId="6">
+  <w:num w:numId="6" w16cid:durableId="1993636112">
     <w:abstractNumId w:val="0"/>
   </w:num>
-  <w:num w:numId="7">
+  <w:num w:numId="7" w16cid:durableId="914389094">
     <w:abstractNumId w:val="4"/>
   </w:num>
-  <w:num w:numId="8">
+  <w:num w:numId="8" w16cid:durableId="1202783219">
     <w:abstractNumId w:val="15"/>
   </w:num>
-  <w:num w:numId="9">
+  <w:num w:numId="9" w16cid:durableId="1116293747">
     <w:abstractNumId w:val="12"/>
   </w:num>
-  <w:num w:numId="10">
+  <w:num w:numId="10" w16cid:durableId="784235961">
     <w:abstractNumId w:val="12"/>
   </w:num>
-  <w:num w:numId="11">
+  <w:num w:numId="11" w16cid:durableId="1426684681">
     <w:abstractNumId w:val="12"/>
   </w:num>
-  <w:num w:numId="12">
+  <w:num w:numId="12" w16cid:durableId="1462961138">
     <w:abstractNumId w:val="12"/>
   </w:num>
-  <w:num w:numId="13">
+  <w:num w:numId="13" w16cid:durableId="2057266747">
     <w:abstractNumId w:val="12"/>
   </w:num>
-  <w:num w:numId="14">
+  <w:num w:numId="14" w16cid:durableId="1077632399">
     <w:abstractNumId w:val="12"/>
   </w:num>
-  <w:num w:numId="15">
+  <w:num w:numId="15" w16cid:durableId="85419444">
     <w:abstractNumId w:val="12"/>
   </w:num>
-  <w:num w:numId="16">
+  <w:num w:numId="16" w16cid:durableId="976685481">
     <w:abstractNumId w:val="12"/>
   </w:num>
-  <w:num w:numId="17">
+  <w:num w:numId="17" w16cid:durableId="1615598621">
     <w:abstractNumId w:val="9"/>
   </w:num>
-  <w:num w:numId="18">
+  <w:num w:numId="18" w16cid:durableId="795023389">
     <w:abstractNumId w:val="13"/>
   </w:num>
-  <w:num w:numId="19">
+  <w:num w:numId="19" w16cid:durableId="949505552">
     <w:abstractNumId w:val="14"/>
   </w:num>
-  <w:num w:numId="20">
+  <w:num w:numId="20" w16cid:durableId="8486350">
     <w:abstractNumId w:val="11"/>
   </w:num>
-  <w:num w:numId="21">
+  <w:num w:numId="21" w16cid:durableId="871655538">
     <w:abstractNumId w:val="16"/>
   </w:num>
-  <w:num w:numId="22">
+  <w:num w:numId="22" w16cid:durableId="1973175111">
     <w:abstractNumId w:val="10"/>
   </w:num>
-  <w:num w:numId="23">
+  <w:num w:numId="23" w16cid:durableId="1435244955">
     <w:abstractNumId w:val="2"/>
   </w:num>
-  <w:num w:numId="24">
+  <w:num w:numId="24" w16cid:durableId="1242986537">
     <w:abstractNumId w:val="3"/>
   </w:num>
-  <w:num w:numId="25">
+  <w:num w:numId="25" w16cid:durableId="1617561725">
     <w:abstractNumId w:val="6"/>
   </w:num>
-  <w:num w:numId="26">
+  <w:num w:numId="26" w16cid:durableId="1119106032">
     <w:abstractNumId w:val="17"/>
   </w:num>
-  <w:num w:numId="27">
+  <w:num w:numId="27" w16cid:durableId="887297918">
     <w:abstractNumId w:val="8"/>
   </w:num>
-  <w:num w:numId="28">
+  <w:num w:numId="28" w16cid:durableId="1461731256">
     <w:abstractNumId w:val="12"/>
   </w:num>
-  <w:num w:numId="29">
+  <w:num w:numId="29" w16cid:durableId="337930950">
     <w:abstractNumId w:val="12"/>
   </w:num>
-  <w:num w:numId="30">
+  <w:num w:numId="30" w16cid:durableId="97258307">
     <w:abstractNumId w:val="12"/>
   </w:num>
-  <w:num w:numId="31">
+  <w:num w:numId="31" w16cid:durableId="346752713">
     <w:abstractNumId w:val="12"/>
   </w:num>
 </w:numbering>
 </file>
 
 <file path=word/styles.xml><?xml version="1.0" encoding="utf-8"?>
-<w:styles xmlns:mc="http://schemas.openxmlformats.org/markup-compatibility/2006" xmlns:r="http://schemas.openxmlformats.org/officeDocument/2006/relationships" xmlns:w="http://schemas.openxmlformats.org/wordprocessingml/2006/main" xmlns:w14="http://schemas.microsoft.com/office/word/2010/wordml" xmlns:w15="http://schemas.microsoft.com/office/word/2012/wordml" xmlns:w16se="http://schemas.microsoft.com/office/word/2015/wordml/symex" mc:Ignorable="w14 w15 w16se">
+<w:styles xmlns:mc="http://schemas.openxmlformats.org/markup-compatibility/2006" xmlns:r="http://schemas.openxmlformats.org/officeDocument/2006/relationships" xmlns:w="http://schemas.openxmlformats.org/wordprocessingml/2006/main" xmlns:w14="http://schemas.microsoft.com/office/word/2010/wordml" xmlns:w15="http://schemas.microsoft.com/office/word/2012/wordml" xmlns:w16cex="http://schemas.microsoft.com/office/word/2018/wordml/cex" xmlns:w16cid="http://schemas.microsoft.com/office/word/2016/wordml/cid" xmlns:w16="http://schemas.microsoft.com/office/word/2018/wordml" xmlns:w16du="http://schemas.microsoft.com/office/word/2023/wordml/word16du" xmlns:w16sdtdh="http://schemas.microsoft.com/office/word/2020/wordml/sdtdatahash" xmlns:w16sdtfl="http://schemas.microsoft.com/office/word/2024/wordml/sdtformatlock" xmlns:w16se="http://schemas.microsoft.com/office/word/2015/wordml/symex" mc:Ignorable="w14 w15 w16se w16cid w16 w16cex w16sdtdh w16sdtfl w16du">
   <w:docDefaults>
     <w:rPrDefault>
       <w:rPr>
@@ -5241,7 +5336,7 @@
       </w:pPr>
     </w:pPrDefault>
   </w:docDefaults>
-  <w:latentStyles w:defLockedState="0" w:defUIPriority="99" w:defSemiHidden="0" w:defUnhideWhenUsed="0" w:defQFormat="0" w:count="371">
+  <w:latentStyles w:defLockedState="0" w:defUIPriority="99" w:defSemiHidden="0" w:defUnhideWhenUsed="0" w:defQFormat="0" w:count="376">
     <w:lsdException w:name="Normal" w:uiPriority="0" w:qFormat="1"/>
     <w:lsdException w:name="heading 1" w:uiPriority="9" w:qFormat="1"/>
     <w:lsdException w:name="heading 2" w:semiHidden="1" w:uiPriority="9" w:unhideWhenUsed="1" w:qFormat="1"/>
@@ -5613,6 +5708,11 @@
     <w:lsdException w:name="List Table 5 Dark Accent 6" w:uiPriority="50"/>
     <w:lsdException w:name="List Table 6 Colorful Accent 6" w:uiPriority="51"/>
     <w:lsdException w:name="List Table 7 Colorful Accent 6" w:uiPriority="52"/>
+    <w:lsdException w:name="Mention" w:semiHidden="1" w:unhideWhenUsed="1"/>
+    <w:lsdException w:name="Smart Hyperlink" w:semiHidden="1" w:unhideWhenUsed="1"/>
+    <w:lsdException w:name="Hashtag" w:semiHidden="1" w:unhideWhenUsed="1"/>
+    <w:lsdException w:name="Unresolved Mention" w:semiHidden="1" w:unhideWhenUsed="1"/>
+    <w:lsdException w:name="Smart Link" w:semiHidden="1" w:unhideWhenUsed="1"/>
   </w:latentStyles>
   <w:style w:type="paragraph" w:default="1" w:styleId="Normal">
     <w:name w:val="Normal"/>
@@ -6342,8 +6442,8 @@
       <w:spacing w:val="0"/>
     </w:rPr>
   </w:style>
-  <w:style w:type="character" w:customStyle="1" w:styleId="UnresolvedMention">
-    <w:name w:val="Unresolved Mention"/>
+  <w:style w:type="character" w:customStyle="1" w:styleId="Mencinsinresolver1">
+    <w:name w:val="Mención sin resolver1"/>
     <w:basedOn w:val="Fuentedeprrafopredeter"/>
     <w:uiPriority w:val="99"/>
     <w:semiHidden/>
@@ -6619,6 +6719,15 @@
 </file>
 
 <file path=customXml/item1.xml><?xml version="1.0" encoding="utf-8"?>
+<?mso-contentType ?>
+<FormTemplates xmlns="http://schemas.microsoft.com/sharepoint/v3/contenttype/forms">
+  <Display>DocumentLibraryForm</Display>
+  <Edit>DocumentLibraryForm</Edit>
+  <New>DocumentLibraryForm</New>
+</FormTemplates>
+</file>
+
+<file path=customXml/item2.xml><?xml version="1.0" encoding="utf-8"?>
 <ct:contentTypeSchema xmlns:ct="http://schemas.microsoft.com/office/2006/metadata/contentType" xmlns:ma="http://schemas.microsoft.com/office/2006/metadata/properties/metaAttributes" ct:_="" ma:_="" ma:contentTypeName="Documento" ma:contentTypeID="0x010100B4326AB81C6CF248AA54994EC2B758A4" ma:contentTypeVersion="11" ma:contentTypeDescription="Crear nuevo documento." ma:contentTypeScope="" ma:versionID="71b6670b48d8c51b791f3a7ca35e6ecd">
   <xsd:schema xmlns:xsd="http://www.w3.org/2001/XMLSchema" xmlns:xs="http://www.w3.org/2001/XMLSchema" xmlns:p="http://schemas.microsoft.com/office/2006/metadata/properties" xmlns:ns2="e75426e2-0f14-43b8-86bb-aece17810ea6" xmlns:ns3="4d6f739f-0c4a-4009-b70a-e57ccd87c7d3" targetNamespace="http://schemas.microsoft.com/office/2006/metadata/properties" ma:root="true" ma:fieldsID="8d68a84c4d9006f9a4de50fb13e999e4" ns2:_="" ns3:_="">
     <xsd:import namespace="e75426e2-0f14-43b8-86bb-aece17810ea6"/>
@@ -6813,16 +6922,11 @@
 </ct:contentTypeSchema>
 </file>
 
-<file path=customXml/item2.xml><?xml version="1.0" encoding="utf-8"?>
-<?mso-contentType ?>
-<FormTemplates xmlns="http://schemas.microsoft.com/sharepoint/v3/contenttype/forms">
-  <Display>DocumentLibraryForm</Display>
-  <Edit>DocumentLibraryForm</Edit>
-  <New>DocumentLibraryForm</New>
-</FormTemplates>
+<file path=customXml/item3.xml><?xml version="1.0" encoding="utf-8"?>
+<b:Sources xmlns:b="http://schemas.openxmlformats.org/officeDocument/2006/bibliography" xmlns="http://schemas.openxmlformats.org/officeDocument/2006/bibliography" SelectedStyle="\APASixthEditionOfficeOnline.xsl" StyleName="APA" Version="6"/>
 </file>
 
-<file path=customXml/item3.xml><?xml version="1.0" encoding="utf-8"?>
+<file path=customXml/item4.xml><?xml version="1.0" encoding="utf-8"?>
 <p:properties xmlns:p="http://schemas.microsoft.com/office/2006/metadata/properties" xmlns:xsi="http://www.w3.org/2001/XMLSchema-instance" xmlns:pc="http://schemas.microsoft.com/office/infopath/2007/PartnerControls">
   <documentManagement>
     <lcf76f155ced4ddcb4097134ff3c332f xmlns="e75426e2-0f14-43b8-86bb-aece17810ea6">
@@ -6833,11 +6937,15 @@
 </p:properties>
 </file>
 
-<file path=customXml/item4.xml><?xml version="1.0" encoding="utf-8"?>
-<b:Sources xmlns:b="http://schemas.openxmlformats.org/officeDocument/2006/bibliography" xmlns="http://schemas.openxmlformats.org/officeDocument/2006/bibliography" SelectedStyle="\APASixthEditionOfficeOnline.xsl" StyleName="APA" Version="6"/>
+<file path=customXml/itemProps1.xml><?xml version="1.0" encoding="utf-8"?>
+<ds:datastoreItem xmlns:ds="http://schemas.openxmlformats.org/officeDocument/2006/customXml" ds:itemID="{ACC078CF-58FC-47AC-858E-2CB5E76CEED8}">
+  <ds:schemaRefs>
+    <ds:schemaRef ds:uri="http://schemas.microsoft.com/sharepoint/v3/contenttype/forms"/>
+  </ds:schemaRefs>
+</ds:datastoreItem>
 </file>
 
-<file path=customXml/itemProps1.xml><?xml version="1.0" encoding="utf-8"?>
+<file path=customXml/itemProps2.xml><?xml version="1.0" encoding="utf-8"?>
 <ds:datastoreItem xmlns:ds="http://schemas.openxmlformats.org/officeDocument/2006/customXml" ds:itemID="{5BC37E72-B61F-4667-AB97-B373D9C0B812}">
   <ds:schemaRefs>
     <ds:schemaRef ds:uri="http://schemas.microsoft.com/office/2006/metadata/contentType"/>
@@ -6856,15 +6964,15 @@
 </ds:datastoreItem>
 </file>
 
-<file path=customXml/itemProps2.xml><?xml version="1.0" encoding="utf-8"?>
-<ds:datastoreItem xmlns:ds="http://schemas.openxmlformats.org/officeDocument/2006/customXml" ds:itemID="{ACC078CF-58FC-47AC-858E-2CB5E76CEED8}">
+<file path=customXml/itemProps3.xml><?xml version="1.0" encoding="utf-8"?>
+<ds:datastoreItem xmlns:ds="http://schemas.openxmlformats.org/officeDocument/2006/customXml" ds:itemID="{701F2F92-D17C-413B-93B0-99D7EE015A34}">
   <ds:schemaRefs>
-    <ds:schemaRef ds:uri="http://schemas.microsoft.com/sharepoint/v3/contenttype/forms"/>
+    <ds:schemaRef ds:uri="http://schemas.openxmlformats.org/officeDocument/2006/bibliography"/>
   </ds:schemaRefs>
 </ds:datastoreItem>
 </file>
 
-<file path=customXml/itemProps3.xml><?xml version="1.0" encoding="utf-8"?>
+<file path=customXml/itemProps4.xml><?xml version="1.0" encoding="utf-8"?>
 <ds:datastoreItem xmlns:ds="http://schemas.openxmlformats.org/officeDocument/2006/customXml" ds:itemID="{FAFA83BF-41A5-43F8-A170-C1C0FB8B386C}">
   <ds:schemaRefs>
     <ds:schemaRef ds:uri="http://schemas.microsoft.com/office/2006/metadata/properties"/>
@@ -6875,14 +6983,6 @@
 </ds:datastoreItem>
 </file>
 
-<file path=customXml/itemProps4.xml><?xml version="1.0" encoding="utf-8"?>
-<ds:datastoreItem xmlns:ds="http://schemas.openxmlformats.org/officeDocument/2006/customXml" ds:itemID="{701F2F92-D17C-413B-93B0-99D7EE015A34}">
-  <ds:schemaRefs>
-    <ds:schemaRef ds:uri="http://schemas.openxmlformats.org/officeDocument/2006/bibliography"/>
-  </ds:schemaRefs>
-</ds:datastoreItem>
-</file>
-
 <file path=docMetadata/LabelInfo.xml><?xml version="1.0" encoding="utf-8"?>
 <clbl:labelList xmlns:clbl="http://schemas.microsoft.com/office/2020/mipLabelMetadata">
   <clbl:label id="{05ea74a3-92c5-4c31-978a-925c3c799cd0}" enabled="0" method="" siteId="{05ea74a3-92c5-4c31-978a-925c3c799cd0}" removed="1"/>

</xml_diff>

<commit_message>
Update Documentation with description of the work
</commit_message>
<xml_diff>
--- a/documentation/IPS_PLANTILLA.docx
+++ b/documentation/IPS_PLANTILLA.docx
@@ -343,7 +343,7 @@
         <mc:AlternateContent>
           <mc:Choice Requires="wpg">
             <w:drawing>
-              <wp:anchor distT="0" distB="0" distL="114300" distR="114300" simplePos="0" relativeHeight="251657216" behindDoc="0" locked="0" layoutInCell="1" allowOverlap="1" wp14:anchorId="22D30FB4" wp14:editId="669CC5C5">
+              <wp:anchor distT="0" distB="0" distL="114300" distR="114300" simplePos="0" relativeHeight="251657216" behindDoc="0" locked="0" layoutInCell="1" allowOverlap="1" wp14:anchorId="22D30FB4" wp14:editId="15425793">
                 <wp:simplePos x="0" y="0"/>
                 <wp:positionH relativeFrom="margin">
                   <wp:posOffset>5715</wp:posOffset>
@@ -833,7 +833,7 @@
           <w:lang w:eastAsia="es-ES"/>
         </w:rPr>
         <w:drawing>
-          <wp:anchor distT="0" distB="0" distL="114300" distR="114300" simplePos="0" relativeHeight="251662336" behindDoc="0" locked="0" layoutInCell="1" allowOverlap="1" wp14:anchorId="25B6BA17" wp14:editId="29902F20">
+          <wp:anchor distT="0" distB="0" distL="114300" distR="114300" simplePos="0" relativeHeight="251662336" behindDoc="0" locked="0" layoutInCell="1" allowOverlap="1" wp14:anchorId="25B6BA17" wp14:editId="5E013AA1">
             <wp:simplePos x="0" y="0"/>
             <wp:positionH relativeFrom="rightMargin">
               <wp:posOffset>-6051681</wp:posOffset>
@@ -1031,7 +1031,7 @@
           <w:lang w:eastAsia="es-ES"/>
         </w:rPr>
         <w:drawing>
-          <wp:anchor distT="0" distB="0" distL="114300" distR="114300" simplePos="0" relativeHeight="251659264" behindDoc="0" locked="0" layoutInCell="1" allowOverlap="1" wp14:anchorId="303242B3" wp14:editId="04ED9595">
+          <wp:anchor distT="0" distB="0" distL="114300" distR="114300" simplePos="0" relativeHeight="251659264" behindDoc="0" locked="0" layoutInCell="1" allowOverlap="1" wp14:anchorId="303242B3" wp14:editId="69402CBD">
             <wp:simplePos x="0" y="0"/>
             <wp:positionH relativeFrom="rightMargin">
               <wp:posOffset>184416</wp:posOffset>
@@ -1106,7 +1106,7 @@
         <mc:AlternateContent>
           <mc:Choice Requires="wps">
             <w:drawing>
-              <wp:anchor distT="0" distB="0" distL="114300" distR="114300" simplePos="0" relativeHeight="251658240" behindDoc="0" locked="0" layoutInCell="1" allowOverlap="1" wp14:anchorId="0CDF1DDC" wp14:editId="668925B6">
+              <wp:anchor distT="0" distB="0" distL="114300" distR="114300" simplePos="0" relativeHeight="251658240" behindDoc="0" locked="0" layoutInCell="1" allowOverlap="1" wp14:anchorId="0CDF1DDC" wp14:editId="65C798F4">
                 <wp:simplePos x="0" y="0"/>
                 <wp:positionH relativeFrom="margin">
                   <wp:align>center</wp:align>
@@ -1189,12 +1189,15 @@
                     </wps:wsp>
                   </a:graphicData>
                 </a:graphic>
+                <wp14:sizeRelV relativeFrom="margin">
+                  <wp14:pctHeight>0</wp14:pctHeight>
+                </wp14:sizeRelV>
               </wp:anchor>
             </w:drawing>
           </mc:Choice>
           <mc:Fallback>
             <w:pict>
-              <v:shape w14:anchorId="0CDF1DDC" id="Cuadro de texto 1" o:spid="_x0000_s1036" type="#_x0000_t202" style="position:absolute;margin-left:0;margin-top:424.6pt;width:225.2pt;height:47pt;z-index:251658240;visibility:visible;mso-wrap-style:none;mso-wrap-distance-left:9pt;mso-wrap-distance-top:0;mso-wrap-distance-right:9pt;mso-wrap-distance-bottom:0;mso-position-horizontal:center;mso-position-horizontal-relative:margin;mso-position-vertical:absolute;mso-position-vertical-relative:text;v-text-anchor:top" o:gfxdata="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" filled="f" stroked="f">
+              <v:shape w14:anchorId="0CDF1DDC" id="Cuadro de texto 1" o:spid="_x0000_s1036" type="#_x0000_t202" style="position:absolute;margin-left:0;margin-top:424.6pt;width:225.2pt;height:47pt;z-index:251658240;visibility:visible;mso-wrap-style:none;mso-height-percent:0;mso-wrap-distance-left:9pt;mso-wrap-distance-top:0;mso-wrap-distance-right:9pt;mso-wrap-distance-bottom:0;mso-position-horizontal:center;mso-position-horizontal-relative:margin;mso-position-vertical:absolute;mso-position-vertical-relative:text;mso-height-percent:0;mso-height-relative:margin;v-text-anchor:top" o:gfxdata="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" filled="f" stroked="f">
                 <v:textbox style="mso-fit-shape-to-text:t">
                   <w:txbxContent>
                     <w:p>
@@ -1326,12 +1329,10 @@
           <w:noProof/>
         </w:rPr>
       </w:pPr>
-      <w:bookmarkStart w:id="0" w:name="_Toc159977585"/>
       <w:r>
         <w:lastRenderedPageBreak/>
-        <w:t>ÍNDICE</w:t>
-      </w:r>
-      <w:bookmarkEnd w:id="0"/>
+        <w:t>INDEX</w:t>
+      </w:r>
     </w:p>
     <w:p>
       <w:pPr>
@@ -2183,10 +2184,771 @@
           <w:bottom w:val="single" w:sz="4" w:space="4" w:color="auto"/>
         </w:pBdr>
       </w:pPr>
-      <w:bookmarkStart w:id="1" w:name="_Toc240364220"/>
+      <w:bookmarkStart w:id="0" w:name="_Toc240364220"/>
       <w:r>
         <w:lastRenderedPageBreak/>
         <w:t>System’s description</w:t>
+      </w:r>
+      <w:bookmarkEnd w:id="0"/>
+    </w:p>
+    <w:p>
+      <w:pPr>
+        <w:jc w:val="both"/>
+      </w:pPr>
+      <w:r>
+        <w:t xml:space="preserve">The </w:t>
+      </w:r>
+      <w:proofErr w:type="spellStart"/>
+      <w:r>
+        <w:t>project</w:t>
+      </w:r>
+      <w:proofErr w:type="spellEnd"/>
+      <w:r>
+        <w:t xml:space="preserve"> </w:t>
+      </w:r>
+      <w:proofErr w:type="spellStart"/>
+      <w:r>
+        <w:t>consists</w:t>
+      </w:r>
+      <w:proofErr w:type="spellEnd"/>
+      <w:r>
+        <w:t xml:space="preserve"> </w:t>
+      </w:r>
+      <w:proofErr w:type="spellStart"/>
+      <w:r>
+        <w:t>of</w:t>
+      </w:r>
+      <w:proofErr w:type="spellEnd"/>
+      <w:r>
+        <w:t xml:space="preserve"> </w:t>
+      </w:r>
+      <w:proofErr w:type="spellStart"/>
+      <w:r>
+        <w:t>developing</w:t>
+      </w:r>
+      <w:proofErr w:type="spellEnd"/>
+      <w:r>
+        <w:t xml:space="preserve"> </w:t>
+      </w:r>
+      <w:proofErr w:type="spellStart"/>
+      <w:r>
+        <w:t>an</w:t>
+      </w:r>
+      <w:proofErr w:type="spellEnd"/>
+      <w:r>
+        <w:t xml:space="preserve"> </w:t>
+      </w:r>
+      <w:proofErr w:type="spellStart"/>
+      <w:r>
+        <w:t>integrated</w:t>
+      </w:r>
+      <w:proofErr w:type="spellEnd"/>
+      <w:r>
+        <w:t xml:space="preserve"> </w:t>
+      </w:r>
+      <w:proofErr w:type="spellStart"/>
+      <w:r>
+        <w:t>management</w:t>
+      </w:r>
+      <w:proofErr w:type="spellEnd"/>
+      <w:r>
+        <w:t xml:space="preserve"> </w:t>
+      </w:r>
+      <w:proofErr w:type="spellStart"/>
+      <w:r>
+        <w:t>application</w:t>
+      </w:r>
+      <w:proofErr w:type="spellEnd"/>
+      <w:r>
+        <w:t xml:space="preserve"> </w:t>
+      </w:r>
+      <w:proofErr w:type="spellStart"/>
+      <w:r>
+        <w:t>for</w:t>
+      </w:r>
+      <w:proofErr w:type="spellEnd"/>
+      <w:r>
+        <w:t xml:space="preserve"> a </w:t>
+      </w:r>
+      <w:proofErr w:type="spellStart"/>
+      <w:r>
+        <w:t>professional</w:t>
+      </w:r>
+      <w:proofErr w:type="spellEnd"/>
+      <w:r>
+        <w:t xml:space="preserve"> </w:t>
+      </w:r>
+      <w:proofErr w:type="spellStart"/>
+      <w:r>
+        <w:t>football</w:t>
+      </w:r>
+      <w:proofErr w:type="spellEnd"/>
+      <w:r>
+        <w:t xml:space="preserve"> club, </w:t>
+      </w:r>
+      <w:proofErr w:type="spellStart"/>
+      <w:r>
+        <w:t>structured</w:t>
+      </w:r>
+      <w:proofErr w:type="spellEnd"/>
+      <w:r>
+        <w:t xml:space="preserve"> </w:t>
+      </w:r>
+      <w:proofErr w:type="spellStart"/>
+      <w:r>
+        <w:t>into</w:t>
+      </w:r>
+      <w:proofErr w:type="spellEnd"/>
+      <w:r>
+        <w:t xml:space="preserve"> </w:t>
+      </w:r>
+      <w:proofErr w:type="spellStart"/>
+      <w:r>
+        <w:t>three</w:t>
+      </w:r>
+      <w:proofErr w:type="spellEnd"/>
+      <w:r>
+        <w:t xml:space="preserve"> </w:t>
+      </w:r>
+      <w:proofErr w:type="spellStart"/>
+      <w:r>
+        <w:t>main</w:t>
+      </w:r>
+      <w:proofErr w:type="spellEnd"/>
+      <w:r>
+        <w:t xml:space="preserve"> modules: </w:t>
+      </w:r>
+      <w:proofErr w:type="spellStart"/>
+      <w:r>
+        <w:t>sports</w:t>
+      </w:r>
+      <w:proofErr w:type="spellEnd"/>
+      <w:r>
+        <w:t xml:space="preserve"> and </w:t>
+      </w:r>
+      <w:proofErr w:type="spellStart"/>
+      <w:r>
+        <w:t>personnel</w:t>
+      </w:r>
+      <w:proofErr w:type="spellEnd"/>
+      <w:r>
+        <w:t xml:space="preserve"> </w:t>
+      </w:r>
+      <w:proofErr w:type="spellStart"/>
+      <w:r>
+        <w:t>management</w:t>
+      </w:r>
+      <w:proofErr w:type="spellEnd"/>
+      <w:r>
+        <w:t xml:space="preserve">, </w:t>
+      </w:r>
+      <w:proofErr w:type="spellStart"/>
+      <w:r>
+        <w:t>commercial</w:t>
+      </w:r>
+      <w:proofErr w:type="spellEnd"/>
+      <w:r>
+        <w:t xml:space="preserve"> </w:t>
+      </w:r>
+      <w:proofErr w:type="spellStart"/>
+      <w:r>
+        <w:t>operations</w:t>
+      </w:r>
+      <w:proofErr w:type="spellEnd"/>
+      <w:r>
+        <w:t xml:space="preserve">, and </w:t>
+      </w:r>
+      <w:proofErr w:type="spellStart"/>
+      <w:r>
+        <w:t>corporate</w:t>
+      </w:r>
+      <w:proofErr w:type="spellEnd"/>
+      <w:r>
+        <w:t xml:space="preserve"> </w:t>
+      </w:r>
+      <w:proofErr w:type="spellStart"/>
+      <w:r>
+        <w:t>administration</w:t>
+      </w:r>
+      <w:proofErr w:type="spellEnd"/>
+      <w:r>
+        <w:t xml:space="preserve">. </w:t>
+      </w:r>
+    </w:p>
+    <w:p>
+      <w:pPr>
+        <w:jc w:val="both"/>
+      </w:pPr>
+      <w:r>
+        <w:t xml:space="preserve">The </w:t>
+      </w:r>
+      <w:proofErr w:type="spellStart"/>
+      <w:r>
+        <w:t>sports</w:t>
+      </w:r>
+      <w:proofErr w:type="spellEnd"/>
+      <w:r>
+        <w:t xml:space="preserve"> and </w:t>
+      </w:r>
+      <w:proofErr w:type="spellStart"/>
+      <w:r>
+        <w:t>personnel</w:t>
+      </w:r>
+      <w:proofErr w:type="spellEnd"/>
+      <w:r>
+        <w:t xml:space="preserve"> module </w:t>
+      </w:r>
+      <w:proofErr w:type="spellStart"/>
+      <w:r>
+        <w:t>handles</w:t>
+      </w:r>
+      <w:proofErr w:type="spellEnd"/>
+      <w:r>
+        <w:t xml:space="preserve"> </w:t>
+      </w:r>
+      <w:proofErr w:type="spellStart"/>
+      <w:r>
+        <w:t>scheduling</w:t>
+      </w:r>
+      <w:proofErr w:type="spellEnd"/>
+      <w:r>
+        <w:t xml:space="preserve">, training </w:t>
+      </w:r>
+      <w:proofErr w:type="spellStart"/>
+      <w:r>
+        <w:t>sessions</w:t>
+      </w:r>
+      <w:proofErr w:type="spellEnd"/>
+      <w:r>
+        <w:t xml:space="preserve">, and </w:t>
+      </w:r>
+      <w:proofErr w:type="spellStart"/>
+      <w:r>
+        <w:t>player</w:t>
+      </w:r>
+      <w:proofErr w:type="spellEnd"/>
+      <w:r>
+        <w:t xml:space="preserve"> </w:t>
+      </w:r>
+      <w:proofErr w:type="spellStart"/>
+      <w:r>
+        <w:t>recovery</w:t>
+      </w:r>
+      <w:proofErr w:type="spellEnd"/>
+      <w:r>
+        <w:t xml:space="preserve">, </w:t>
+      </w:r>
+      <w:proofErr w:type="spellStart"/>
+      <w:r>
+        <w:t>distinguishing</w:t>
+      </w:r>
+      <w:proofErr w:type="spellEnd"/>
+      <w:r>
+        <w:t xml:space="preserve"> </w:t>
+      </w:r>
+      <w:proofErr w:type="spellStart"/>
+      <w:r>
+        <w:t>between</w:t>
+      </w:r>
+      <w:proofErr w:type="spellEnd"/>
+      <w:r>
+        <w:t xml:space="preserve"> </w:t>
+      </w:r>
+      <w:proofErr w:type="spellStart"/>
+      <w:r>
+        <w:t>athletic</w:t>
+      </w:r>
+      <w:proofErr w:type="spellEnd"/>
+      <w:r>
+        <w:t xml:space="preserve"> staff (</w:t>
+      </w:r>
+      <w:proofErr w:type="spellStart"/>
+      <w:r>
+        <w:t>men</w:t>
+      </w:r>
+      <w:r>
+        <w:t>’s</w:t>
+      </w:r>
+      <w:proofErr w:type="spellEnd"/>
+      <w:r>
+        <w:t xml:space="preserve"> </w:t>
+      </w:r>
+      <w:r>
+        <w:t xml:space="preserve">and </w:t>
+      </w:r>
+      <w:proofErr w:type="spellStart"/>
+      <w:r>
+        <w:t>women</w:t>
+      </w:r>
+      <w:r>
+        <w:t>’</w:t>
+      </w:r>
+      <w:r>
+        <w:t>s</w:t>
+      </w:r>
+      <w:proofErr w:type="spellEnd"/>
+      <w:r>
+        <w:t xml:space="preserve"> </w:t>
+      </w:r>
+      <w:proofErr w:type="spellStart"/>
+      <w:r>
+        <w:t>squads</w:t>
+      </w:r>
+      <w:proofErr w:type="spellEnd"/>
+      <w:r>
+        <w:t xml:space="preserve">, </w:t>
+      </w:r>
+      <w:proofErr w:type="spellStart"/>
+      <w:r>
+        <w:t>technical</w:t>
+      </w:r>
+      <w:proofErr w:type="spellEnd"/>
+      <w:r>
+        <w:t xml:space="preserve"> staff) and </w:t>
+      </w:r>
+      <w:proofErr w:type="spellStart"/>
+      <w:r>
+        <w:t>operational</w:t>
+      </w:r>
+      <w:proofErr w:type="spellEnd"/>
+      <w:r>
+        <w:t xml:space="preserve"> </w:t>
+      </w:r>
+      <w:proofErr w:type="spellStart"/>
+      <w:r>
+        <w:t>employees</w:t>
+      </w:r>
+      <w:proofErr w:type="spellEnd"/>
+      <w:r>
+        <w:t xml:space="preserve"> (medical, </w:t>
+      </w:r>
+      <w:proofErr w:type="spellStart"/>
+      <w:r>
+        <w:t>maintenance</w:t>
+      </w:r>
+      <w:proofErr w:type="spellEnd"/>
+      <w:r>
+        <w:t xml:space="preserve">, </w:t>
+      </w:r>
+      <w:proofErr w:type="spellStart"/>
+      <w:r>
+        <w:t>security</w:t>
+      </w:r>
+      <w:proofErr w:type="spellEnd"/>
+      <w:r>
+        <w:t xml:space="preserve">). </w:t>
+      </w:r>
+      <w:proofErr w:type="spellStart"/>
+      <w:r>
+        <w:t>It</w:t>
+      </w:r>
+      <w:proofErr w:type="spellEnd"/>
+      <w:r>
+        <w:t xml:space="preserve"> </w:t>
+      </w:r>
+      <w:proofErr w:type="spellStart"/>
+      <w:r>
+        <w:t>automates</w:t>
+      </w:r>
+      <w:proofErr w:type="spellEnd"/>
+      <w:r>
+        <w:t xml:space="preserve"> </w:t>
+      </w:r>
+      <w:proofErr w:type="spellStart"/>
+      <w:r>
+        <w:t>schedules</w:t>
+      </w:r>
+      <w:proofErr w:type="spellEnd"/>
+      <w:r>
+        <w:t xml:space="preserve"> </w:t>
+      </w:r>
+      <w:proofErr w:type="spellStart"/>
+      <w:r>
+        <w:t>to</w:t>
+      </w:r>
+      <w:proofErr w:type="spellEnd"/>
+      <w:r>
+        <w:t xml:space="preserve"> </w:t>
+      </w:r>
+      <w:proofErr w:type="spellStart"/>
+      <w:r>
+        <w:t>prevent</w:t>
+      </w:r>
+      <w:proofErr w:type="spellEnd"/>
+      <w:r>
+        <w:t xml:space="preserve"> </w:t>
+      </w:r>
+      <w:proofErr w:type="spellStart"/>
+      <w:r>
+        <w:t>overlapping</w:t>
+      </w:r>
+      <w:proofErr w:type="spellEnd"/>
+      <w:r>
+        <w:t xml:space="preserve"> </w:t>
+      </w:r>
+      <w:proofErr w:type="spellStart"/>
+      <w:r>
+        <w:t>tasks</w:t>
+      </w:r>
+      <w:proofErr w:type="spellEnd"/>
+      <w:r>
+        <w:t xml:space="preserve">, </w:t>
+      </w:r>
+      <w:proofErr w:type="spellStart"/>
+      <w:r>
+        <w:t>tracks</w:t>
+      </w:r>
+      <w:proofErr w:type="spellEnd"/>
+      <w:r>
+        <w:t xml:space="preserve"> match </w:t>
+      </w:r>
+      <w:proofErr w:type="spellStart"/>
+      <w:r>
+        <w:t>statistics</w:t>
+      </w:r>
+      <w:proofErr w:type="spellEnd"/>
+      <w:r>
+        <w:t xml:space="preserve"> </w:t>
+      </w:r>
+      <w:proofErr w:type="spellStart"/>
+      <w:r>
+        <w:t>for</w:t>
+      </w:r>
+      <w:proofErr w:type="spellEnd"/>
+      <w:r>
+        <w:t xml:space="preserve"> performance </w:t>
+      </w:r>
+      <w:proofErr w:type="spellStart"/>
+      <w:r>
+        <w:t>analysis</w:t>
+      </w:r>
+      <w:proofErr w:type="spellEnd"/>
+      <w:r>
+        <w:t xml:space="preserve">, and </w:t>
+      </w:r>
+      <w:proofErr w:type="spellStart"/>
+      <w:r>
+        <w:t>records</w:t>
+      </w:r>
+      <w:proofErr w:type="spellEnd"/>
+      <w:r>
+        <w:t xml:space="preserve"> medical </w:t>
+      </w:r>
+      <w:proofErr w:type="spellStart"/>
+      <w:r>
+        <w:t>reports</w:t>
+      </w:r>
+      <w:proofErr w:type="spellEnd"/>
+      <w:r>
+        <w:t xml:space="preserve"> </w:t>
+      </w:r>
+      <w:proofErr w:type="spellStart"/>
+      <w:r>
+        <w:t>until</w:t>
+      </w:r>
+      <w:proofErr w:type="spellEnd"/>
+      <w:r>
+        <w:t xml:space="preserve"> </w:t>
+      </w:r>
+      <w:proofErr w:type="spellStart"/>
+      <w:r>
+        <w:t>injured</w:t>
+      </w:r>
+      <w:proofErr w:type="spellEnd"/>
+      <w:r>
+        <w:t xml:space="preserve"> </w:t>
+      </w:r>
+      <w:proofErr w:type="spellStart"/>
+      <w:r>
+        <w:t>players</w:t>
+      </w:r>
+      <w:proofErr w:type="spellEnd"/>
+      <w:r>
+        <w:t xml:space="preserve"> </w:t>
+      </w:r>
+      <w:proofErr w:type="spellStart"/>
+      <w:r>
+        <w:t>receive</w:t>
+      </w:r>
+      <w:proofErr w:type="spellEnd"/>
+      <w:r>
+        <w:t xml:space="preserve"> medical </w:t>
+      </w:r>
+      <w:proofErr w:type="spellStart"/>
+      <w:r>
+        <w:t>clearance</w:t>
+      </w:r>
+      <w:proofErr w:type="spellEnd"/>
+      <w:r>
+        <w:t xml:space="preserve">. </w:t>
+      </w:r>
+    </w:p>
+    <w:p>
+      <w:pPr>
+        <w:jc w:val="both"/>
+      </w:pPr>
+      <w:r>
+        <w:t xml:space="preserve">The </w:t>
+      </w:r>
+      <w:proofErr w:type="spellStart"/>
+      <w:r>
+        <w:t>commercial</w:t>
+      </w:r>
+      <w:proofErr w:type="spellEnd"/>
+      <w:r>
+        <w:t xml:space="preserve"> and </w:t>
+      </w:r>
+      <w:proofErr w:type="spellStart"/>
+      <w:r>
+        <w:t>corporate</w:t>
+      </w:r>
+      <w:proofErr w:type="spellEnd"/>
+      <w:r>
+        <w:t xml:space="preserve"> modules </w:t>
+      </w:r>
+      <w:proofErr w:type="spellStart"/>
+      <w:r>
+        <w:t>streamline</w:t>
+      </w:r>
+      <w:proofErr w:type="spellEnd"/>
+      <w:r>
+        <w:t xml:space="preserve"> </w:t>
+      </w:r>
+      <w:proofErr w:type="spellStart"/>
+      <w:r>
+        <w:t>point</w:t>
+      </w:r>
+      <w:proofErr w:type="spellEnd"/>
+      <w:r>
+        <w:t>-</w:t>
+      </w:r>
+      <w:proofErr w:type="spellStart"/>
+      <w:r>
+        <w:t>of</w:t>
+      </w:r>
+      <w:proofErr w:type="spellEnd"/>
+      <w:r>
+        <w:t xml:space="preserve">-sale store </w:t>
+      </w:r>
+      <w:proofErr w:type="spellStart"/>
+      <w:r>
+        <w:t>transactions</w:t>
+      </w:r>
+      <w:proofErr w:type="spellEnd"/>
+      <w:r>
+        <w:t xml:space="preserve">, </w:t>
+      </w:r>
+      <w:proofErr w:type="spellStart"/>
+      <w:r>
+        <w:t>matchday</w:t>
+      </w:r>
+      <w:proofErr w:type="spellEnd"/>
+      <w:r>
+        <w:t xml:space="preserve"> </w:t>
+      </w:r>
+      <w:proofErr w:type="spellStart"/>
+      <w:r>
+        <w:t>ticketing</w:t>
+      </w:r>
+      <w:proofErr w:type="spellEnd"/>
+      <w:r>
+        <w:t>, and non-</w:t>
+      </w:r>
+      <w:proofErr w:type="spellStart"/>
+      <w:r>
+        <w:t>transferable</w:t>
+      </w:r>
+      <w:proofErr w:type="spellEnd"/>
+      <w:r>
+        <w:t xml:space="preserve"> </w:t>
+      </w:r>
+      <w:proofErr w:type="spellStart"/>
+      <w:r>
+        <w:t>season</w:t>
+      </w:r>
+      <w:proofErr w:type="spellEnd"/>
+      <w:r>
+        <w:t xml:space="preserve"> </w:t>
+      </w:r>
+      <w:proofErr w:type="spellStart"/>
+      <w:r>
+        <w:t>passes</w:t>
+      </w:r>
+      <w:proofErr w:type="spellEnd"/>
+      <w:r>
+        <w:t xml:space="preserve">. </w:t>
+      </w:r>
+      <w:proofErr w:type="spellStart"/>
+      <w:r>
+        <w:t>Additionally</w:t>
+      </w:r>
+      <w:proofErr w:type="spellEnd"/>
+      <w:r>
+        <w:t xml:space="preserve">, </w:t>
+      </w:r>
+      <w:proofErr w:type="spellStart"/>
+      <w:r>
+        <w:t>the</w:t>
+      </w:r>
+      <w:proofErr w:type="spellEnd"/>
+      <w:r>
+        <w:t xml:space="preserve"> </w:t>
+      </w:r>
+      <w:proofErr w:type="spellStart"/>
+      <w:r>
+        <w:t>system</w:t>
+      </w:r>
+      <w:proofErr w:type="spellEnd"/>
+      <w:r>
+        <w:t xml:space="preserve"> </w:t>
+      </w:r>
+      <w:proofErr w:type="spellStart"/>
+      <w:r>
+        <w:t>provides</w:t>
+      </w:r>
+      <w:proofErr w:type="spellEnd"/>
+      <w:r>
+        <w:t xml:space="preserve"> club executives and </w:t>
+      </w:r>
+      <w:proofErr w:type="spellStart"/>
+      <w:r>
+        <w:t>shareholders</w:t>
+      </w:r>
+      <w:proofErr w:type="spellEnd"/>
+      <w:r>
+        <w:t xml:space="preserve"> </w:t>
+      </w:r>
+      <w:proofErr w:type="spellStart"/>
+      <w:r>
+        <w:t>with</w:t>
+      </w:r>
+      <w:proofErr w:type="spellEnd"/>
+      <w:r>
+        <w:t xml:space="preserve"> </w:t>
+      </w:r>
+      <w:proofErr w:type="spellStart"/>
+      <w:r>
+        <w:t>equity</w:t>
+      </w:r>
+      <w:proofErr w:type="spellEnd"/>
+      <w:r>
+        <w:t xml:space="preserve"> trading </w:t>
+      </w:r>
+      <w:proofErr w:type="spellStart"/>
+      <w:r>
+        <w:t>records</w:t>
+      </w:r>
+      <w:proofErr w:type="spellEnd"/>
+      <w:r>
+        <w:t xml:space="preserve">, </w:t>
+      </w:r>
+      <w:proofErr w:type="spellStart"/>
+      <w:r>
+        <w:t>simplified</w:t>
+      </w:r>
+      <w:proofErr w:type="spellEnd"/>
+      <w:r>
+        <w:t xml:space="preserve"> </w:t>
+      </w:r>
+      <w:proofErr w:type="spellStart"/>
+      <w:r>
+        <w:t>tax</w:t>
+      </w:r>
+      <w:proofErr w:type="spellEnd"/>
+      <w:r>
+        <w:t xml:space="preserve"> </w:t>
+      </w:r>
+      <w:proofErr w:type="spellStart"/>
+      <w:r>
+        <w:t>reporting</w:t>
+      </w:r>
+      <w:proofErr w:type="spellEnd"/>
+      <w:r>
+        <w:t xml:space="preserve">, and </w:t>
+      </w:r>
+      <w:proofErr w:type="spellStart"/>
+      <w:r>
+        <w:t>automated</w:t>
+      </w:r>
+      <w:proofErr w:type="spellEnd"/>
+      <w:r>
+        <w:t xml:space="preserve"> </w:t>
+      </w:r>
+      <w:proofErr w:type="spellStart"/>
+      <w:r>
+        <w:t>financial</w:t>
+      </w:r>
+      <w:proofErr w:type="spellEnd"/>
+      <w:r>
+        <w:t xml:space="preserve"> </w:t>
+      </w:r>
+      <w:proofErr w:type="spellStart"/>
+      <w:r>
+        <w:t>summaries</w:t>
+      </w:r>
+      <w:proofErr w:type="spellEnd"/>
+      <w:r>
+        <w:t xml:space="preserve"> tracking </w:t>
+      </w:r>
+      <w:proofErr w:type="spellStart"/>
+      <w:r>
+        <w:t>revenues</w:t>
+      </w:r>
+      <w:proofErr w:type="spellEnd"/>
+      <w:r>
+        <w:t xml:space="preserve"> and </w:t>
+      </w:r>
+      <w:proofErr w:type="spellStart"/>
+      <w:r>
+        <w:t>operating</w:t>
+      </w:r>
+      <w:proofErr w:type="spellEnd"/>
+      <w:r>
+        <w:t xml:space="preserve"> expenses </w:t>
+      </w:r>
+      <w:proofErr w:type="spellStart"/>
+      <w:r>
+        <w:t>to</w:t>
+      </w:r>
+      <w:proofErr w:type="spellEnd"/>
+      <w:r>
+        <w:t xml:space="preserve"> </w:t>
+      </w:r>
+      <w:proofErr w:type="spellStart"/>
+      <w:r>
+        <w:t>deliver</w:t>
+      </w:r>
+      <w:proofErr w:type="spellEnd"/>
+      <w:r>
+        <w:t xml:space="preserve"> real-time </w:t>
+      </w:r>
+      <w:proofErr w:type="spellStart"/>
+      <w:r>
+        <w:t>profit</w:t>
+      </w:r>
+      <w:proofErr w:type="spellEnd"/>
+      <w:r>
+        <w:t>-and-</w:t>
+      </w:r>
+      <w:proofErr w:type="spellStart"/>
+      <w:r>
+        <w:t>loss</w:t>
+      </w:r>
+      <w:proofErr w:type="spellEnd"/>
+      <w:r>
+        <w:t xml:space="preserve"> balances.</w:t>
+      </w:r>
+    </w:p>
+    <w:p>
+      <w:pPr>
+        <w:pStyle w:val="Ttulo1"/>
+        <w:pBdr>
+          <w:bottom w:val="single" w:sz="4" w:space="1" w:color="auto"/>
+        </w:pBdr>
+      </w:pPr>
+      <w:bookmarkStart w:id="1" w:name="_Toc240364221"/>
+      <w:r>
+        <w:t>user roles</w:t>
       </w:r>
       <w:bookmarkEnd w:id="1"/>
     </w:p>
@@ -2199,14 +2961,1193 @@
           <w:bottom w:val="single" w:sz="4" w:space="1" w:color="auto"/>
         </w:pBdr>
       </w:pPr>
-      <w:bookmarkStart w:id="2" w:name="_Toc240364221"/>
-      <w:r>
-        <w:t>user roles</w:t>
+      <w:bookmarkStart w:id="2" w:name="_Toc240364222"/>
+      <w:r>
+        <w:t>Technological environment</w:t>
       </w:r>
       <w:bookmarkEnd w:id="2"/>
     </w:p>
-    <w:p/>
-    <w:p/>
+    <w:p>
+      <w:pPr>
+        <w:jc w:val="both"/>
+      </w:pPr>
+      <w:r>
+        <w:t xml:space="preserve">For </w:t>
+      </w:r>
+      <w:proofErr w:type="spellStart"/>
+      <w:r>
+        <w:t>this</w:t>
+      </w:r>
+      <w:proofErr w:type="spellEnd"/>
+      <w:r>
+        <w:t xml:space="preserve"> </w:t>
+      </w:r>
+      <w:proofErr w:type="spellStart"/>
+      <w:r>
+        <w:t>project</w:t>
+      </w:r>
+      <w:proofErr w:type="spellEnd"/>
+      <w:r>
+        <w:t xml:space="preserve">, </w:t>
+      </w:r>
+      <w:proofErr w:type="spellStart"/>
+      <w:r>
+        <w:t>we</w:t>
+      </w:r>
+      <w:proofErr w:type="spellEnd"/>
+      <w:r>
+        <w:t xml:space="preserve"> </w:t>
+      </w:r>
+      <w:proofErr w:type="spellStart"/>
+      <w:r>
+        <w:t>built</w:t>
+      </w:r>
+      <w:proofErr w:type="spellEnd"/>
+      <w:r>
+        <w:t xml:space="preserve"> </w:t>
+      </w:r>
+      <w:proofErr w:type="spellStart"/>
+      <w:r>
+        <w:t>the</w:t>
+      </w:r>
+      <w:proofErr w:type="spellEnd"/>
+      <w:r>
+        <w:t xml:space="preserve"> </w:t>
+      </w:r>
+      <w:proofErr w:type="gramStart"/>
+      <w:r>
+        <w:t>app</w:t>
+      </w:r>
+      <w:proofErr w:type="gramEnd"/>
+      <w:r>
+        <w:t xml:space="preserve"> </w:t>
+      </w:r>
+      <w:proofErr w:type="spellStart"/>
+      <w:r>
+        <w:t>using</w:t>
+      </w:r>
+      <w:proofErr w:type="spellEnd"/>
+      <w:r>
+        <w:t xml:space="preserve"> Java </w:t>
+      </w:r>
+      <w:proofErr w:type="spellStart"/>
+      <w:r>
+        <w:t>with</w:t>
+      </w:r>
+      <w:proofErr w:type="spellEnd"/>
+      <w:r>
+        <w:t xml:space="preserve"> JDK 21 so </w:t>
+      </w:r>
+      <w:proofErr w:type="spellStart"/>
+      <w:r>
+        <w:t>we</w:t>
+      </w:r>
+      <w:proofErr w:type="spellEnd"/>
+      <w:r>
+        <w:t xml:space="preserve"> </w:t>
+      </w:r>
+      <w:proofErr w:type="spellStart"/>
+      <w:r>
+        <w:t>could</w:t>
+      </w:r>
+      <w:proofErr w:type="spellEnd"/>
+      <w:r>
+        <w:t xml:space="preserve"> </w:t>
+      </w:r>
+      <w:proofErr w:type="spellStart"/>
+      <w:r>
+        <w:t>take</w:t>
+      </w:r>
+      <w:proofErr w:type="spellEnd"/>
+      <w:r>
+        <w:t xml:space="preserve"> </w:t>
+      </w:r>
+      <w:proofErr w:type="spellStart"/>
+      <w:r>
+        <w:t>advantage</w:t>
+      </w:r>
+      <w:proofErr w:type="spellEnd"/>
+      <w:r>
+        <w:t xml:space="preserve"> </w:t>
+      </w:r>
+      <w:proofErr w:type="spellStart"/>
+      <w:r>
+        <w:t>of</w:t>
+      </w:r>
+      <w:proofErr w:type="spellEnd"/>
+      <w:r>
+        <w:t xml:space="preserve"> </w:t>
+      </w:r>
+      <w:proofErr w:type="spellStart"/>
+      <w:r>
+        <w:t>modern</w:t>
+      </w:r>
+      <w:proofErr w:type="spellEnd"/>
+      <w:r>
+        <w:t xml:space="preserve"> </w:t>
+      </w:r>
+      <w:proofErr w:type="spellStart"/>
+      <w:r>
+        <w:t>language</w:t>
+      </w:r>
+      <w:proofErr w:type="spellEnd"/>
+      <w:r>
+        <w:t xml:space="preserve"> </w:t>
+      </w:r>
+      <w:proofErr w:type="spellStart"/>
+      <w:r>
+        <w:t>features</w:t>
+      </w:r>
+      <w:proofErr w:type="spellEnd"/>
+      <w:r>
+        <w:t xml:space="preserve"> and LTS </w:t>
+      </w:r>
+      <w:proofErr w:type="spellStart"/>
+      <w:r>
+        <w:t>stability</w:t>
+      </w:r>
+      <w:proofErr w:type="spellEnd"/>
+      <w:r>
+        <w:t xml:space="preserve">. </w:t>
+      </w:r>
+      <w:proofErr w:type="spellStart"/>
+      <w:r>
+        <w:t>Depending</w:t>
+      </w:r>
+      <w:proofErr w:type="spellEnd"/>
+      <w:r>
+        <w:t xml:space="preserve"> </w:t>
+      </w:r>
+      <w:proofErr w:type="spellStart"/>
+      <w:r>
+        <w:t>on</w:t>
+      </w:r>
+      <w:proofErr w:type="spellEnd"/>
+      <w:r>
+        <w:t xml:space="preserve"> personal </w:t>
+      </w:r>
+      <w:proofErr w:type="spellStart"/>
+      <w:r>
+        <w:t>preference</w:t>
+      </w:r>
+      <w:proofErr w:type="spellEnd"/>
+      <w:r>
+        <w:t xml:space="preserve">, </w:t>
+      </w:r>
+      <w:proofErr w:type="spellStart"/>
+      <w:r>
+        <w:t>our</w:t>
+      </w:r>
+      <w:proofErr w:type="spellEnd"/>
+      <w:r>
+        <w:t xml:space="preserve"> </w:t>
+      </w:r>
+      <w:proofErr w:type="spellStart"/>
+      <w:r>
+        <w:t>team</w:t>
+      </w:r>
+      <w:proofErr w:type="spellEnd"/>
+      <w:r>
+        <w:t xml:space="preserve"> </w:t>
+      </w:r>
+      <w:proofErr w:type="spellStart"/>
+      <w:r>
+        <w:t>worked</w:t>
+      </w:r>
+      <w:proofErr w:type="spellEnd"/>
+      <w:r>
+        <w:t xml:space="preserve"> </w:t>
+      </w:r>
+      <w:proofErr w:type="spellStart"/>
+      <w:r>
+        <w:t>between</w:t>
+      </w:r>
+      <w:proofErr w:type="spellEnd"/>
+      <w:r>
+        <w:t xml:space="preserve"> IntelliJ IDEA and Eclipse, </w:t>
+      </w:r>
+      <w:proofErr w:type="spellStart"/>
+      <w:r>
+        <w:t>since</w:t>
+      </w:r>
+      <w:proofErr w:type="spellEnd"/>
+      <w:r>
+        <w:t xml:space="preserve"> </w:t>
+      </w:r>
+      <w:proofErr w:type="spellStart"/>
+      <w:r>
+        <w:t>both</w:t>
+      </w:r>
+      <w:proofErr w:type="spellEnd"/>
+      <w:r>
+        <w:t xml:space="preserve"> </w:t>
+      </w:r>
+      <w:proofErr w:type="spellStart"/>
+      <w:r>
+        <w:t>handle</w:t>
+      </w:r>
+      <w:proofErr w:type="spellEnd"/>
+      <w:r>
+        <w:t xml:space="preserve"> Maven </w:t>
+      </w:r>
+      <w:proofErr w:type="spellStart"/>
+      <w:r>
+        <w:t>projects</w:t>
+      </w:r>
+      <w:proofErr w:type="spellEnd"/>
+      <w:r>
+        <w:t xml:space="preserve"> </w:t>
+      </w:r>
+      <w:proofErr w:type="spellStart"/>
+      <w:r>
+        <w:t>seamlessly</w:t>
+      </w:r>
+      <w:proofErr w:type="spellEnd"/>
+      <w:r>
+        <w:t xml:space="preserve"> </w:t>
+      </w:r>
+      <w:proofErr w:type="spellStart"/>
+      <w:r>
+        <w:t>out</w:t>
+      </w:r>
+      <w:proofErr w:type="spellEnd"/>
+      <w:r>
+        <w:t xml:space="preserve"> </w:t>
+      </w:r>
+      <w:proofErr w:type="spellStart"/>
+      <w:r>
+        <w:t>of</w:t>
+      </w:r>
+      <w:proofErr w:type="spellEnd"/>
+      <w:r>
+        <w:t xml:space="preserve"> </w:t>
+      </w:r>
+      <w:proofErr w:type="spellStart"/>
+      <w:r>
+        <w:t>the</w:t>
+      </w:r>
+      <w:proofErr w:type="spellEnd"/>
+      <w:r>
+        <w:t xml:space="preserve"> box.</w:t>
+      </w:r>
+    </w:p>
+    <w:p>
+      <w:pPr>
+        <w:jc w:val="both"/>
+      </w:pPr>
+      <w:r>
+        <w:t xml:space="preserve">The desktop </w:t>
+      </w:r>
+      <w:proofErr w:type="gramStart"/>
+      <w:r>
+        <w:t>interface</w:t>
+      </w:r>
+      <w:proofErr w:type="gramEnd"/>
+      <w:r>
+        <w:t xml:space="preserve"> </w:t>
+      </w:r>
+      <w:proofErr w:type="spellStart"/>
+      <w:r>
+        <w:t>was</w:t>
+      </w:r>
+      <w:proofErr w:type="spellEnd"/>
+      <w:r>
+        <w:t xml:space="preserve"> </w:t>
+      </w:r>
+      <w:proofErr w:type="spellStart"/>
+      <w:r>
+        <w:t>built</w:t>
+      </w:r>
+      <w:proofErr w:type="spellEnd"/>
+      <w:r>
+        <w:t xml:space="preserve"> </w:t>
+      </w:r>
+      <w:proofErr w:type="spellStart"/>
+      <w:r>
+        <w:t>with</w:t>
+      </w:r>
+      <w:proofErr w:type="spellEnd"/>
+      <w:r>
+        <w:t xml:space="preserve"> standard </w:t>
+      </w:r>
+      <w:r>
+        <w:rPr>
+          <w:b/>
+          <w:bCs/>
+        </w:rPr>
+        <w:t xml:space="preserve">Java Swing </w:t>
+      </w:r>
+      <w:proofErr w:type="spellStart"/>
+      <w:r>
+        <w:t>for</w:t>
+      </w:r>
+      <w:proofErr w:type="spellEnd"/>
+      <w:r>
+        <w:t xml:space="preserve"> </w:t>
+      </w:r>
+      <w:proofErr w:type="spellStart"/>
+      <w:r>
+        <w:t>the</w:t>
+      </w:r>
+      <w:proofErr w:type="spellEnd"/>
+      <w:r>
+        <w:t xml:space="preserve"> </w:t>
+      </w:r>
+      <w:proofErr w:type="spellStart"/>
+      <w:r>
+        <w:t>windows</w:t>
+      </w:r>
+      <w:proofErr w:type="spellEnd"/>
+      <w:r>
+        <w:t xml:space="preserve">, tables, and </w:t>
+      </w:r>
+      <w:proofErr w:type="spellStart"/>
+      <w:r>
+        <w:t>buttons</w:t>
+      </w:r>
+      <w:proofErr w:type="spellEnd"/>
+      <w:r>
+        <w:t xml:space="preserve">. For </w:t>
+      </w:r>
+      <w:proofErr w:type="spellStart"/>
+      <w:r>
+        <w:t>the</w:t>
+      </w:r>
+      <w:proofErr w:type="spellEnd"/>
+      <w:r>
+        <w:t xml:space="preserve"> </w:t>
+      </w:r>
+      <w:proofErr w:type="spellStart"/>
+      <w:r>
+        <w:t>database</w:t>
+      </w:r>
+      <w:proofErr w:type="spellEnd"/>
+      <w:r>
+        <w:t xml:space="preserve">, </w:t>
+      </w:r>
+      <w:proofErr w:type="spellStart"/>
+      <w:r>
+        <w:t>we</w:t>
+      </w:r>
+      <w:proofErr w:type="spellEnd"/>
+      <w:r>
+        <w:t xml:space="preserve"> </w:t>
+      </w:r>
+      <w:proofErr w:type="spellStart"/>
+      <w:r>
+        <w:t>went</w:t>
+      </w:r>
+      <w:proofErr w:type="spellEnd"/>
+      <w:r>
+        <w:t xml:space="preserve"> </w:t>
+      </w:r>
+      <w:proofErr w:type="spellStart"/>
+      <w:r>
+        <w:t>with</w:t>
+      </w:r>
+      <w:proofErr w:type="spellEnd"/>
+      <w:r>
+        <w:t xml:space="preserve"> </w:t>
+      </w:r>
+      <w:r>
+        <w:rPr>
+          <w:b/>
+          <w:bCs/>
+        </w:rPr>
+        <w:t xml:space="preserve">SQLite </w:t>
+      </w:r>
+      <w:proofErr w:type="spellStart"/>
+      <w:r>
+        <w:t>because</w:t>
+      </w:r>
+      <w:proofErr w:type="spellEnd"/>
+      <w:r>
+        <w:t xml:space="preserve"> </w:t>
+      </w:r>
+      <w:proofErr w:type="spellStart"/>
+      <w:r>
+        <w:t>it</w:t>
+      </w:r>
+      <w:proofErr w:type="spellEnd"/>
+      <w:r>
+        <w:t xml:space="preserve"> </w:t>
+      </w:r>
+      <w:proofErr w:type="spellStart"/>
+      <w:r>
+        <w:t>keeps</w:t>
+      </w:r>
+      <w:proofErr w:type="spellEnd"/>
+      <w:r>
+        <w:t xml:space="preserve"> </w:t>
+      </w:r>
+      <w:proofErr w:type="spellStart"/>
+      <w:r>
+        <w:t>things</w:t>
+      </w:r>
+      <w:proofErr w:type="spellEnd"/>
+      <w:r>
+        <w:t xml:space="preserve"> simple: </w:t>
+      </w:r>
+      <w:proofErr w:type="spellStart"/>
+      <w:r>
+        <w:t>it</w:t>
+      </w:r>
+      <w:proofErr w:type="spellEnd"/>
+      <w:r>
+        <w:t xml:space="preserve"> </w:t>
+      </w:r>
+      <w:proofErr w:type="spellStart"/>
+      <w:r>
+        <w:t>runs</w:t>
+      </w:r>
+      <w:proofErr w:type="spellEnd"/>
+      <w:r>
+        <w:t xml:space="preserve"> </w:t>
+      </w:r>
+      <w:proofErr w:type="spellStart"/>
+      <w:r>
+        <w:t>locally</w:t>
+      </w:r>
+      <w:proofErr w:type="spellEnd"/>
+      <w:r>
+        <w:t xml:space="preserve"> </w:t>
+      </w:r>
+      <w:proofErr w:type="spellStart"/>
+      <w:r>
+        <w:t>out</w:t>
+      </w:r>
+      <w:proofErr w:type="spellEnd"/>
+      <w:r>
+        <w:t xml:space="preserve"> </w:t>
+      </w:r>
+      <w:proofErr w:type="spellStart"/>
+      <w:r>
+        <w:t>of</w:t>
+      </w:r>
+      <w:proofErr w:type="spellEnd"/>
+      <w:r>
+        <w:t xml:space="preserve"> a </w:t>
+      </w:r>
+      <w:proofErr w:type="gramStart"/>
+      <w:r>
+        <w:t>single</w:t>
+      </w:r>
+      <w:proofErr w:type="gramEnd"/>
+      <w:r>
+        <w:t xml:space="preserve"> file (</w:t>
+      </w:r>
+      <w:r>
+        <w:rPr>
+          <w:b/>
+          <w:bCs/>
+        </w:rPr>
+        <w:t>data/</w:t>
+      </w:r>
+      <w:proofErr w:type="spellStart"/>
+      <w:r>
+        <w:rPr>
+          <w:b/>
+          <w:bCs/>
+        </w:rPr>
+        <w:t>demo.db</w:t>
+      </w:r>
+      <w:proofErr w:type="spellEnd"/>
+      <w:r>
+        <w:t xml:space="preserve">) </w:t>
+      </w:r>
+      <w:proofErr w:type="spellStart"/>
+      <w:r>
+        <w:t>that</w:t>
+      </w:r>
+      <w:proofErr w:type="spellEnd"/>
+      <w:r>
+        <w:t xml:space="preserve"> </w:t>
+      </w:r>
+      <w:proofErr w:type="spellStart"/>
+      <w:r>
+        <w:t>generates</w:t>
+      </w:r>
+      <w:proofErr w:type="spellEnd"/>
+      <w:r>
+        <w:t xml:space="preserve"> </w:t>
+      </w:r>
+      <w:proofErr w:type="spellStart"/>
+      <w:r>
+        <w:t>automatically</w:t>
+      </w:r>
+      <w:proofErr w:type="spellEnd"/>
+      <w:r>
+        <w:t xml:space="preserve"> </w:t>
+      </w:r>
+      <w:proofErr w:type="spellStart"/>
+      <w:r>
+        <w:t>the</w:t>
+      </w:r>
+      <w:proofErr w:type="spellEnd"/>
+      <w:r>
+        <w:t xml:space="preserve"> </w:t>
+      </w:r>
+      <w:proofErr w:type="spellStart"/>
+      <w:r>
+        <w:t>first</w:t>
+      </w:r>
+      <w:proofErr w:type="spellEnd"/>
+      <w:r>
+        <w:t xml:space="preserve"> time </w:t>
+      </w:r>
+      <w:proofErr w:type="spellStart"/>
+      <w:r>
+        <w:t>you</w:t>
+      </w:r>
+      <w:proofErr w:type="spellEnd"/>
+      <w:r>
+        <w:t xml:space="preserve"> run </w:t>
+      </w:r>
+      <w:proofErr w:type="spellStart"/>
+      <w:r>
+        <w:t>the</w:t>
+      </w:r>
+      <w:proofErr w:type="spellEnd"/>
+      <w:r>
+        <w:t xml:space="preserve"> </w:t>
+      </w:r>
+      <w:proofErr w:type="gramStart"/>
+      <w:r>
+        <w:t>app</w:t>
+      </w:r>
+      <w:proofErr w:type="gramEnd"/>
+      <w:r>
+        <w:t xml:space="preserve">, </w:t>
+      </w:r>
+      <w:proofErr w:type="spellStart"/>
+      <w:r>
+        <w:t>meaning</w:t>
+      </w:r>
+      <w:proofErr w:type="spellEnd"/>
+      <w:r>
+        <w:t xml:space="preserve"> no one </w:t>
+      </w:r>
+      <w:proofErr w:type="spellStart"/>
+      <w:r>
+        <w:t>on</w:t>
+      </w:r>
+      <w:proofErr w:type="spellEnd"/>
+      <w:r>
+        <w:t xml:space="preserve"> </w:t>
+      </w:r>
+      <w:proofErr w:type="spellStart"/>
+      <w:r>
+        <w:t>the</w:t>
+      </w:r>
+      <w:proofErr w:type="spellEnd"/>
+      <w:r>
+        <w:t xml:space="preserve"> </w:t>
+      </w:r>
+      <w:proofErr w:type="spellStart"/>
+      <w:r>
+        <w:t>team</w:t>
+      </w:r>
+      <w:proofErr w:type="spellEnd"/>
+      <w:r>
+        <w:t xml:space="preserve"> </w:t>
+      </w:r>
+      <w:proofErr w:type="spellStart"/>
+      <w:r>
+        <w:t>had</w:t>
+      </w:r>
+      <w:proofErr w:type="spellEnd"/>
+      <w:r>
+        <w:t xml:space="preserve"> </w:t>
+      </w:r>
+      <w:proofErr w:type="spellStart"/>
+      <w:r>
+        <w:t>to</w:t>
+      </w:r>
+      <w:proofErr w:type="spellEnd"/>
+      <w:r>
+        <w:t xml:space="preserve"> </w:t>
+      </w:r>
+      <w:proofErr w:type="spellStart"/>
+      <w:r>
+        <w:t>waste</w:t>
+      </w:r>
+      <w:proofErr w:type="spellEnd"/>
+      <w:r>
+        <w:t xml:space="preserve"> time </w:t>
+      </w:r>
+      <w:proofErr w:type="spellStart"/>
+      <w:r>
+        <w:t>setting</w:t>
+      </w:r>
+      <w:proofErr w:type="spellEnd"/>
+      <w:r>
+        <w:t xml:space="preserve"> up </w:t>
+      </w:r>
+      <w:proofErr w:type="spellStart"/>
+      <w:r>
+        <w:t>or</w:t>
+      </w:r>
+      <w:proofErr w:type="spellEnd"/>
+      <w:r>
+        <w:t xml:space="preserve"> </w:t>
+      </w:r>
+      <w:proofErr w:type="spellStart"/>
+      <w:r>
+        <w:t>maintaining</w:t>
+      </w:r>
+      <w:proofErr w:type="spellEnd"/>
+      <w:r>
+        <w:t xml:space="preserve"> </w:t>
+      </w:r>
+      <w:proofErr w:type="spellStart"/>
+      <w:r>
+        <w:t>an</w:t>
+      </w:r>
+      <w:proofErr w:type="spellEnd"/>
+      <w:r>
+        <w:t xml:space="preserve"> </w:t>
+      </w:r>
+      <w:proofErr w:type="spellStart"/>
+      <w:r>
+        <w:t>external</w:t>
+      </w:r>
+      <w:proofErr w:type="spellEnd"/>
+      <w:r>
+        <w:t xml:space="preserve"> SQL server.</w:t>
+      </w:r>
+    </w:p>
+    <w:p>
+      <w:pPr>
+        <w:jc w:val="both"/>
+      </w:pPr>
+      <w:proofErr w:type="spellStart"/>
+      <w:r>
+        <w:t>We</w:t>
+      </w:r>
+      <w:proofErr w:type="spellEnd"/>
+      <w:r>
+        <w:t xml:space="preserve"> </w:t>
+      </w:r>
+      <w:proofErr w:type="spellStart"/>
+      <w:r>
+        <w:t>coordinated</w:t>
+      </w:r>
+      <w:proofErr w:type="spellEnd"/>
+      <w:r>
+        <w:t xml:space="preserve"> </w:t>
+      </w:r>
+      <w:proofErr w:type="spellStart"/>
+      <w:r>
+        <w:t>our</w:t>
+      </w:r>
+      <w:proofErr w:type="spellEnd"/>
+      <w:r>
+        <w:t xml:space="preserve"> </w:t>
+      </w:r>
+      <w:proofErr w:type="spellStart"/>
+      <w:r>
+        <w:t>code</w:t>
+      </w:r>
+      <w:proofErr w:type="spellEnd"/>
+      <w:r>
+        <w:t xml:space="preserve"> </w:t>
+      </w:r>
+      <w:proofErr w:type="spellStart"/>
+      <w:r>
+        <w:t>through</w:t>
+      </w:r>
+      <w:proofErr w:type="spellEnd"/>
+      <w:r>
+        <w:t xml:space="preserve"> Git and </w:t>
+      </w:r>
+      <w:proofErr w:type="spellStart"/>
+      <w:r>
+        <w:t>hosted</w:t>
+      </w:r>
+      <w:proofErr w:type="spellEnd"/>
+      <w:r>
+        <w:t xml:space="preserve"> </w:t>
+      </w:r>
+      <w:proofErr w:type="spellStart"/>
+      <w:r>
+        <w:t>the</w:t>
+      </w:r>
+      <w:proofErr w:type="spellEnd"/>
+      <w:r>
+        <w:t xml:space="preserve"> </w:t>
+      </w:r>
+      <w:proofErr w:type="spellStart"/>
+      <w:r>
+        <w:t>team</w:t>
+      </w:r>
+      <w:proofErr w:type="spellEnd"/>
+      <w:r>
+        <w:t xml:space="preserve"> </w:t>
+      </w:r>
+      <w:proofErr w:type="spellStart"/>
+      <w:r>
+        <w:t>repository</w:t>
+      </w:r>
+      <w:proofErr w:type="spellEnd"/>
+      <w:r>
+        <w:t xml:space="preserve"> </w:t>
+      </w:r>
+      <w:proofErr w:type="spellStart"/>
+      <w:r>
+        <w:t>on</w:t>
+      </w:r>
+      <w:proofErr w:type="spellEnd"/>
+      <w:r>
+        <w:t xml:space="preserve"> GitHub (IPS2026-PL11-ING). </w:t>
+      </w:r>
+      <w:proofErr w:type="spellStart"/>
+      <w:r>
+        <w:t>To</w:t>
+      </w:r>
+      <w:proofErr w:type="spellEnd"/>
+      <w:r>
+        <w:t xml:space="preserve"> </w:t>
+      </w:r>
+      <w:proofErr w:type="spellStart"/>
+      <w:r>
+        <w:t>keep</w:t>
+      </w:r>
+      <w:proofErr w:type="spellEnd"/>
+      <w:r>
+        <w:t xml:space="preserve"> </w:t>
+      </w:r>
+      <w:proofErr w:type="spellStart"/>
+      <w:r>
+        <w:t>everyone’s</w:t>
+      </w:r>
+      <w:proofErr w:type="spellEnd"/>
+      <w:r>
+        <w:t xml:space="preserve"> </w:t>
+      </w:r>
+      <w:proofErr w:type="spellStart"/>
+      <w:r>
+        <w:t>environment</w:t>
+      </w:r>
+      <w:proofErr w:type="spellEnd"/>
+      <w:r>
+        <w:t xml:space="preserve"> </w:t>
+      </w:r>
+      <w:proofErr w:type="spellStart"/>
+      <w:r>
+        <w:t>consistent</w:t>
+      </w:r>
+      <w:proofErr w:type="spellEnd"/>
+      <w:r>
+        <w:t xml:space="preserve">, </w:t>
+      </w:r>
+      <w:proofErr w:type="spellStart"/>
+      <w:r>
+        <w:t>we</w:t>
+      </w:r>
+      <w:proofErr w:type="spellEnd"/>
+      <w:r>
+        <w:t xml:space="preserve"> </w:t>
+      </w:r>
+      <w:proofErr w:type="spellStart"/>
+      <w:r>
+        <w:t>used</w:t>
+      </w:r>
+      <w:proofErr w:type="spellEnd"/>
+      <w:r>
+        <w:t xml:space="preserve"> Maven </w:t>
+      </w:r>
+      <w:proofErr w:type="spellStart"/>
+      <w:r>
+        <w:t>to</w:t>
+      </w:r>
+      <w:proofErr w:type="spellEnd"/>
+      <w:r>
+        <w:t xml:space="preserve"> </w:t>
+      </w:r>
+      <w:proofErr w:type="spellStart"/>
+      <w:r>
+        <w:t>manage</w:t>
+      </w:r>
+      <w:proofErr w:type="spellEnd"/>
+      <w:r>
+        <w:t xml:space="preserve"> </w:t>
+      </w:r>
+      <w:proofErr w:type="spellStart"/>
+      <w:r>
+        <w:t>dependencies</w:t>
+      </w:r>
+      <w:proofErr w:type="spellEnd"/>
+      <w:r>
+        <w:t xml:space="preserve">, run </w:t>
+      </w:r>
+      <w:proofErr w:type="spellStart"/>
+      <w:r>
+        <w:t>our</w:t>
+      </w:r>
+      <w:proofErr w:type="spellEnd"/>
+      <w:r>
+        <w:t xml:space="preserve"> </w:t>
+      </w:r>
+      <w:proofErr w:type="spellStart"/>
+      <w:r>
+        <w:t>JUnit</w:t>
+      </w:r>
+      <w:proofErr w:type="spellEnd"/>
+      <w:r>
+        <w:t xml:space="preserve"> 5 </w:t>
+      </w:r>
+      <w:proofErr w:type="spellStart"/>
+      <w:r>
+        <w:t>tests</w:t>
+      </w:r>
+      <w:proofErr w:type="spellEnd"/>
+      <w:r>
+        <w:t xml:space="preserve">, and </w:t>
+      </w:r>
+      <w:proofErr w:type="spellStart"/>
+      <w:r>
+        <w:t>package</w:t>
+      </w:r>
+      <w:proofErr w:type="spellEnd"/>
+      <w:r>
+        <w:t xml:space="preserve"> </w:t>
+      </w:r>
+      <w:proofErr w:type="spellStart"/>
+      <w:r>
+        <w:t>the</w:t>
+      </w:r>
+      <w:proofErr w:type="spellEnd"/>
+      <w:r>
+        <w:t xml:space="preserve"> final </w:t>
+      </w:r>
+      <w:proofErr w:type="spellStart"/>
+      <w:r>
+        <w:t>executable</w:t>
+      </w:r>
+      <w:proofErr w:type="spellEnd"/>
+      <w:r>
+        <w:t xml:space="preserve"> .</w:t>
+      </w:r>
+      <w:proofErr w:type="spellStart"/>
+      <w:r>
+        <w:t>jar</w:t>
+      </w:r>
+      <w:proofErr w:type="spellEnd"/>
+      <w:r>
+        <w:t xml:space="preserve"> file.</w:t>
+      </w:r>
+    </w:p>
+    <w:p>
+      <w:pPr>
+        <w:jc w:val="both"/>
+      </w:pPr>
+      <w:proofErr w:type="spellStart"/>
+      <w:r>
+        <w:t>W</w:t>
+      </w:r>
+      <w:r>
+        <w:t>e</w:t>
+      </w:r>
+      <w:proofErr w:type="spellEnd"/>
+      <w:r>
+        <w:t xml:space="preserve"> </w:t>
+      </w:r>
+      <w:proofErr w:type="spellStart"/>
+      <w:r>
+        <w:t>followed</w:t>
+      </w:r>
+      <w:proofErr w:type="spellEnd"/>
+      <w:r>
+        <w:t xml:space="preserve"> a </w:t>
+      </w:r>
+      <w:proofErr w:type="spellStart"/>
+      <w:r>
+        <w:t>clean</w:t>
+      </w:r>
+      <w:proofErr w:type="spellEnd"/>
+      <w:r>
+        <w:t xml:space="preserve"> </w:t>
+      </w:r>
+      <w:r>
+        <w:rPr>
+          <w:b/>
+          <w:bCs/>
+        </w:rPr>
+        <w:t>MVC (Model-View-Controller)</w:t>
+      </w:r>
+      <w:r>
+        <w:t xml:space="preserve"> </w:t>
+      </w:r>
+      <w:proofErr w:type="spellStart"/>
+      <w:r>
+        <w:t>structure</w:t>
+      </w:r>
+      <w:proofErr w:type="spellEnd"/>
+      <w:r>
+        <w:t xml:space="preserve"> </w:t>
+      </w:r>
+      <w:proofErr w:type="spellStart"/>
+      <w:r>
+        <w:t>inside</w:t>
+      </w:r>
+      <w:proofErr w:type="spellEnd"/>
+      <w:r>
+        <w:t xml:space="preserve"> </w:t>
+      </w:r>
+      <w:proofErr w:type="gramStart"/>
+      <w:r>
+        <w:rPr>
+          <w:b/>
+          <w:bCs/>
+        </w:rPr>
+        <w:t>com.ips2026.pl</w:t>
+      </w:r>
+      <w:proofErr w:type="gramEnd"/>
+      <w:r>
+        <w:rPr>
+          <w:b/>
+          <w:bCs/>
+        </w:rPr>
+        <w:t>11</w:t>
+      </w:r>
+      <w:r>
+        <w:t xml:space="preserve">. Keeping </w:t>
+      </w:r>
+      <w:proofErr w:type="spellStart"/>
+      <w:r>
+        <w:t>the</w:t>
+      </w:r>
+      <w:proofErr w:type="spellEnd"/>
+      <w:r>
+        <w:t xml:space="preserve"> UI, </w:t>
+      </w:r>
+      <w:proofErr w:type="spellStart"/>
+      <w:r>
+        <w:t>business</w:t>
+      </w:r>
+      <w:proofErr w:type="spellEnd"/>
+      <w:r>
+        <w:t xml:space="preserve"> </w:t>
+      </w:r>
+      <w:proofErr w:type="spellStart"/>
+      <w:r>
+        <w:t>logic</w:t>
+      </w:r>
+      <w:proofErr w:type="spellEnd"/>
+      <w:r>
+        <w:t xml:space="preserve">, </w:t>
+      </w:r>
+      <w:r>
+        <w:t xml:space="preserve">data </w:t>
+      </w:r>
+      <w:proofErr w:type="spellStart"/>
+      <w:r>
+        <w:t>models</w:t>
+      </w:r>
+      <w:proofErr w:type="spellEnd"/>
+      <w:r>
+        <w:t xml:space="preserve">, and </w:t>
+      </w:r>
+      <w:proofErr w:type="spellStart"/>
+      <w:r>
+        <w:t>database</w:t>
+      </w:r>
+      <w:proofErr w:type="spellEnd"/>
+      <w:r>
+        <w:t xml:space="preserve"> </w:t>
+      </w:r>
+      <w:proofErr w:type="spellStart"/>
+      <w:r>
+        <w:t>queries</w:t>
+      </w:r>
+      <w:proofErr w:type="spellEnd"/>
+      <w:r>
+        <w:t xml:space="preserve"> </w:t>
+      </w:r>
+      <w:proofErr w:type="spellStart"/>
+      <w:r>
+        <w:t>separate</w:t>
+      </w:r>
+      <w:proofErr w:type="spellEnd"/>
+      <w:r>
+        <w:t xml:space="preserve"> </w:t>
+      </w:r>
+      <w:proofErr w:type="spellStart"/>
+      <w:r>
+        <w:t>made</w:t>
+      </w:r>
+      <w:proofErr w:type="spellEnd"/>
+      <w:r>
+        <w:t xml:space="preserve"> </w:t>
+      </w:r>
+      <w:proofErr w:type="spellStart"/>
+      <w:r>
+        <w:t>it</w:t>
+      </w:r>
+      <w:proofErr w:type="spellEnd"/>
+      <w:r>
+        <w:t xml:space="preserve"> </w:t>
+      </w:r>
+      <w:proofErr w:type="spellStart"/>
+      <w:r>
+        <w:t>much</w:t>
+      </w:r>
+      <w:proofErr w:type="spellEnd"/>
+      <w:r>
+        <w:t xml:space="preserve"> </w:t>
+      </w:r>
+      <w:proofErr w:type="spellStart"/>
+      <w:r>
+        <w:t>easier</w:t>
+      </w:r>
+      <w:proofErr w:type="spellEnd"/>
+      <w:r>
+        <w:t xml:space="preserve"> </w:t>
+      </w:r>
+      <w:proofErr w:type="spellStart"/>
+      <w:r>
+        <w:t>for</w:t>
+      </w:r>
+      <w:proofErr w:type="spellEnd"/>
+      <w:r>
+        <w:t xml:space="preserve"> </w:t>
+      </w:r>
+      <w:proofErr w:type="spellStart"/>
+      <w:r>
+        <w:t>the</w:t>
+      </w:r>
+      <w:proofErr w:type="spellEnd"/>
+      <w:r>
+        <w:t xml:space="preserve"> </w:t>
+      </w:r>
+      <w:proofErr w:type="spellStart"/>
+      <w:r>
+        <w:t>three</w:t>
+      </w:r>
+      <w:proofErr w:type="spellEnd"/>
+      <w:r>
+        <w:t xml:space="preserve"> </w:t>
+      </w:r>
+      <w:proofErr w:type="spellStart"/>
+      <w:r>
+        <w:t>of</w:t>
+      </w:r>
+      <w:proofErr w:type="spellEnd"/>
+      <w:r>
+        <w:t xml:space="preserve"> </w:t>
+      </w:r>
+      <w:proofErr w:type="spellStart"/>
+      <w:r>
+        <w:t>us</w:t>
+      </w:r>
+      <w:proofErr w:type="spellEnd"/>
+      <w:r>
+        <w:t xml:space="preserve"> </w:t>
+      </w:r>
+      <w:proofErr w:type="spellStart"/>
+      <w:r>
+        <w:t>to</w:t>
+      </w:r>
+      <w:proofErr w:type="spellEnd"/>
+      <w:r>
+        <w:t xml:space="preserve"> </w:t>
+      </w:r>
+      <w:proofErr w:type="spellStart"/>
+      <w:r>
+        <w:t>build</w:t>
+      </w:r>
+      <w:proofErr w:type="spellEnd"/>
+      <w:r>
+        <w:t xml:space="preserve"> </w:t>
+      </w:r>
+      <w:proofErr w:type="spellStart"/>
+      <w:r>
+        <w:t>features</w:t>
+      </w:r>
+      <w:proofErr w:type="spellEnd"/>
+      <w:r>
+        <w:t xml:space="preserve"> in </w:t>
+      </w:r>
+      <w:proofErr w:type="spellStart"/>
+      <w:r>
+        <w:t>parallel</w:t>
+      </w:r>
+      <w:proofErr w:type="spellEnd"/>
+      <w:r>
+        <w:t xml:space="preserve"> </w:t>
+      </w:r>
+      <w:proofErr w:type="spellStart"/>
+      <w:r>
+        <w:t>across</w:t>
+      </w:r>
+      <w:proofErr w:type="spellEnd"/>
+      <w:r>
+        <w:t xml:space="preserve"> </w:t>
+      </w:r>
+      <w:proofErr w:type="spellStart"/>
+      <w:r>
+        <w:t>sprints</w:t>
+      </w:r>
+      <w:proofErr w:type="spellEnd"/>
+      <w:r>
+        <w:t xml:space="preserve"> </w:t>
+      </w:r>
+      <w:proofErr w:type="spellStart"/>
+      <w:r>
+        <w:t>without</w:t>
+      </w:r>
+      <w:proofErr w:type="spellEnd"/>
+      <w:r>
+        <w:t xml:space="preserve"> </w:t>
+      </w:r>
+      <w:proofErr w:type="spellStart"/>
+      <w:r>
+        <w:t>stepping</w:t>
+      </w:r>
+      <w:proofErr w:type="spellEnd"/>
+      <w:r>
+        <w:t xml:space="preserve"> </w:t>
+      </w:r>
+      <w:proofErr w:type="spellStart"/>
+      <w:r>
+        <w:t>on</w:t>
+      </w:r>
+      <w:proofErr w:type="spellEnd"/>
+      <w:r>
+        <w:t xml:space="preserve"> </w:t>
+      </w:r>
+      <w:proofErr w:type="spellStart"/>
+      <w:r>
+        <w:t>each</w:t>
+      </w:r>
+      <w:proofErr w:type="spellEnd"/>
+      <w:r>
+        <w:t xml:space="preserve"> </w:t>
+      </w:r>
+      <w:proofErr w:type="spellStart"/>
+      <w:r>
+        <w:t>other's</w:t>
+      </w:r>
+      <w:proofErr w:type="spellEnd"/>
+      <w:r>
+        <w:t xml:space="preserve"> toes.</w:t>
+      </w:r>
+    </w:p>
+    <w:p>
+      <w:pPr>
+        <w:jc w:val="both"/>
+      </w:pPr>
+    </w:p>
+    <w:p>
+      <w:pPr>
+        <w:jc w:val="both"/>
+      </w:pPr>
+    </w:p>
+    <w:p>
+      <w:pPr>
+        <w:jc w:val="both"/>
+      </w:pPr>
+    </w:p>
     <w:p>
       <w:pPr>
         <w:pStyle w:val="Ttulo1"/>
@@ -2214,9 +4155,10 @@
           <w:bottom w:val="single" w:sz="4" w:space="1" w:color="auto"/>
         </w:pBdr>
       </w:pPr>
-      <w:bookmarkStart w:id="3" w:name="_Toc240364222"/>
-      <w:r>
-        <w:t>Technological environment</w:t>
+      <w:bookmarkStart w:id="3" w:name="_Toc240364223"/>
+      <w:r>
+        <w:lastRenderedPageBreak/>
+        <w:t>Story mapping</w:t>
       </w:r>
       <w:bookmarkEnd w:id="3"/>
     </w:p>
@@ -2229,9 +4171,9 @@
           <w:bottom w:val="single" w:sz="4" w:space="1" w:color="auto"/>
         </w:pBdr>
       </w:pPr>
-      <w:bookmarkStart w:id="4" w:name="_Toc240364223"/>
-      <w:r>
-        <w:t>Story mapping</w:t>
+      <w:bookmarkStart w:id="4" w:name="_Toc240364224"/>
+      <w:r>
+        <w:t>Data modelling</w:t>
       </w:r>
       <w:bookmarkEnd w:id="4"/>
     </w:p>
@@ -2244,13 +4186,20 @@
           <w:bottom w:val="single" w:sz="4" w:space="1" w:color="auto"/>
         </w:pBdr>
       </w:pPr>
-      <w:bookmarkStart w:id="5" w:name="_Toc240364224"/>
-      <w:r>
-        <w:t>Data modelling</w:t>
+      <w:bookmarkStart w:id="5" w:name="_Toc240364225"/>
+      <w:r>
+        <w:t xml:space="preserve">User </w:t>
+      </w:r>
+      <w:proofErr w:type="gramStart"/>
+      <w:r>
+        <w:t>interface</w:t>
+      </w:r>
+      <w:proofErr w:type="gramEnd"/>
+      <w:r>
+        <w:t xml:space="preserve"> navigation map</w:t>
       </w:r>
       <w:bookmarkEnd w:id="5"/>
     </w:p>
-    <w:p/>
     <w:p/>
     <w:p>
       <w:pPr>
@@ -2259,33 +4208,11 @@
           <w:bottom w:val="single" w:sz="4" w:space="1" w:color="auto"/>
         </w:pBdr>
       </w:pPr>
-      <w:bookmarkStart w:id="6" w:name="_Toc240364225"/>
-      <w:r>
-        <w:t xml:space="preserve">User </w:t>
-      </w:r>
-      <w:proofErr w:type="gramStart"/>
-      <w:r>
-        <w:t>interface</w:t>
-      </w:r>
-      <w:proofErr w:type="gramEnd"/>
-      <w:r>
-        <w:t xml:space="preserve"> navigation map</w:t>
+      <w:bookmarkStart w:id="6" w:name="_Toc240364226"/>
+      <w:r>
+        <w:t>Annex I: Screen prototypes</w:t>
       </w:r>
       <w:bookmarkEnd w:id="6"/>
-    </w:p>
-    <w:p/>
-    <w:p>
-      <w:pPr>
-        <w:pStyle w:val="Ttulo1"/>
-        <w:pBdr>
-          <w:bottom w:val="single" w:sz="4" w:space="1" w:color="auto"/>
-        </w:pBdr>
-      </w:pPr>
-      <w:bookmarkStart w:id="7" w:name="_Toc240364226"/>
-      <w:r>
-        <w:t>Annex I: Screen prototypes</w:t>
-      </w:r>
-      <w:bookmarkEnd w:id="7"/>
     </w:p>
     <w:p/>
     <w:p>
@@ -2298,14 +4225,14 @@
           <w:lang w:val="en-GB"/>
         </w:rPr>
       </w:pPr>
-      <w:bookmarkStart w:id="8" w:name="_Toc240364227"/>
+      <w:bookmarkStart w:id="7" w:name="_Toc240364227"/>
       <w:r>
         <w:rPr>
           <w:lang w:val="en-GB"/>
         </w:rPr>
         <w:t>Annex II: tasks performed by each member</w:t>
       </w:r>
-      <w:bookmarkEnd w:id="8"/>
+      <w:bookmarkEnd w:id="7"/>
     </w:p>
     <w:sectPr>
       <w:pgSz w:w="11906" w:h="16838"/>
@@ -5964,7 +7891,6 @@
   <w:style w:type="character" w:default="1" w:styleId="Fuentedeprrafopredeter">
     <w:name w:val="Default Paragraph Font"/>
     <w:uiPriority w:val="1"/>
-    <w:semiHidden/>
     <w:unhideWhenUsed/>
   </w:style>
   <w:style w:type="table" w:default="1" w:styleId="Tablanormal">
@@ -6719,15 +8645,6 @@
 </file>
 
 <file path=customXml/item1.xml><?xml version="1.0" encoding="utf-8"?>
-<?mso-contentType ?>
-<FormTemplates xmlns="http://schemas.microsoft.com/sharepoint/v3/contenttype/forms">
-  <Display>DocumentLibraryForm</Display>
-  <Edit>DocumentLibraryForm</Edit>
-  <New>DocumentLibraryForm</New>
-</FormTemplates>
-</file>
-
-<file path=customXml/item2.xml><?xml version="1.0" encoding="utf-8"?>
 <ct:contentTypeSchema xmlns:ct="http://schemas.microsoft.com/office/2006/metadata/contentType" xmlns:ma="http://schemas.microsoft.com/office/2006/metadata/properties/metaAttributes" ct:_="" ma:_="" ma:contentTypeName="Documento" ma:contentTypeID="0x010100B4326AB81C6CF248AA54994EC2B758A4" ma:contentTypeVersion="11" ma:contentTypeDescription="Crear nuevo documento." ma:contentTypeScope="" ma:versionID="71b6670b48d8c51b791f3a7ca35e6ecd">
   <xsd:schema xmlns:xsd="http://www.w3.org/2001/XMLSchema" xmlns:xs="http://www.w3.org/2001/XMLSchema" xmlns:p="http://schemas.microsoft.com/office/2006/metadata/properties" xmlns:ns2="e75426e2-0f14-43b8-86bb-aece17810ea6" xmlns:ns3="4d6f739f-0c4a-4009-b70a-e57ccd87c7d3" targetNamespace="http://schemas.microsoft.com/office/2006/metadata/properties" ma:root="true" ma:fieldsID="8d68a84c4d9006f9a4de50fb13e999e4" ns2:_="" ns3:_="">
     <xsd:import namespace="e75426e2-0f14-43b8-86bb-aece17810ea6"/>
@@ -6922,11 +8839,16 @@
 </ct:contentTypeSchema>
 </file>
 
-<file path=customXml/item3.xml><?xml version="1.0" encoding="utf-8"?>
-<b:Sources xmlns:b="http://schemas.openxmlformats.org/officeDocument/2006/bibliography" xmlns="http://schemas.openxmlformats.org/officeDocument/2006/bibliography" SelectedStyle="\APASixthEditionOfficeOnline.xsl" StyleName="APA" Version="6"/>
+<file path=customXml/item2.xml><?xml version="1.0" encoding="utf-8"?>
+<?mso-contentType ?>
+<FormTemplates xmlns="http://schemas.microsoft.com/sharepoint/v3/contenttype/forms">
+  <Display>DocumentLibraryForm</Display>
+  <Edit>DocumentLibraryForm</Edit>
+  <New>DocumentLibraryForm</New>
+</FormTemplates>
 </file>
 
-<file path=customXml/item4.xml><?xml version="1.0" encoding="utf-8"?>
+<file path=customXml/item3.xml><?xml version="1.0" encoding="utf-8"?>
 <p:properties xmlns:p="http://schemas.microsoft.com/office/2006/metadata/properties" xmlns:xsi="http://www.w3.org/2001/XMLSchema-instance" xmlns:pc="http://schemas.microsoft.com/office/infopath/2007/PartnerControls">
   <documentManagement>
     <lcf76f155ced4ddcb4097134ff3c332f xmlns="e75426e2-0f14-43b8-86bb-aece17810ea6">
@@ -6937,15 +8859,11 @@
 </p:properties>
 </file>
 
-<file path=customXml/itemProps1.xml><?xml version="1.0" encoding="utf-8"?>
-<ds:datastoreItem xmlns:ds="http://schemas.openxmlformats.org/officeDocument/2006/customXml" ds:itemID="{ACC078CF-58FC-47AC-858E-2CB5E76CEED8}">
-  <ds:schemaRefs>
-    <ds:schemaRef ds:uri="http://schemas.microsoft.com/sharepoint/v3/contenttype/forms"/>
-  </ds:schemaRefs>
-</ds:datastoreItem>
+<file path=customXml/item4.xml><?xml version="1.0" encoding="utf-8"?>
+<b:Sources xmlns:b="http://schemas.openxmlformats.org/officeDocument/2006/bibliography" xmlns="http://schemas.openxmlformats.org/officeDocument/2006/bibliography" SelectedStyle="\APASixthEditionOfficeOnline.xsl" StyleName="APA" Version="6"/>
 </file>
 
-<file path=customXml/itemProps2.xml><?xml version="1.0" encoding="utf-8"?>
+<file path=customXml/itemProps1.xml><?xml version="1.0" encoding="utf-8"?>
 <ds:datastoreItem xmlns:ds="http://schemas.openxmlformats.org/officeDocument/2006/customXml" ds:itemID="{5BC37E72-B61F-4667-AB97-B373D9C0B812}">
   <ds:schemaRefs>
     <ds:schemaRef ds:uri="http://schemas.microsoft.com/office/2006/metadata/contentType"/>
@@ -6964,15 +8882,15 @@
 </ds:datastoreItem>
 </file>
 
-<file path=customXml/itemProps3.xml><?xml version="1.0" encoding="utf-8"?>
-<ds:datastoreItem xmlns:ds="http://schemas.openxmlformats.org/officeDocument/2006/customXml" ds:itemID="{701F2F92-D17C-413B-93B0-99D7EE015A34}">
+<file path=customXml/itemProps2.xml><?xml version="1.0" encoding="utf-8"?>
+<ds:datastoreItem xmlns:ds="http://schemas.openxmlformats.org/officeDocument/2006/customXml" ds:itemID="{ACC078CF-58FC-47AC-858E-2CB5E76CEED8}">
   <ds:schemaRefs>
-    <ds:schemaRef ds:uri="http://schemas.openxmlformats.org/officeDocument/2006/bibliography"/>
+    <ds:schemaRef ds:uri="http://schemas.microsoft.com/sharepoint/v3/contenttype/forms"/>
   </ds:schemaRefs>
 </ds:datastoreItem>
 </file>
 
-<file path=customXml/itemProps4.xml><?xml version="1.0" encoding="utf-8"?>
+<file path=customXml/itemProps3.xml><?xml version="1.0" encoding="utf-8"?>
 <ds:datastoreItem xmlns:ds="http://schemas.openxmlformats.org/officeDocument/2006/customXml" ds:itemID="{FAFA83BF-41A5-43F8-A170-C1C0FB8B386C}">
   <ds:schemaRefs>
     <ds:schemaRef ds:uri="http://schemas.microsoft.com/office/2006/metadata/properties"/>
@@ -6983,6 +8901,14 @@
 </ds:datastoreItem>
 </file>
 
+<file path=customXml/itemProps4.xml><?xml version="1.0" encoding="utf-8"?>
+<ds:datastoreItem xmlns:ds="http://schemas.openxmlformats.org/officeDocument/2006/customXml" ds:itemID="{701F2F92-D17C-413B-93B0-99D7EE015A34}">
+  <ds:schemaRefs>
+    <ds:schemaRef ds:uri="http://schemas.openxmlformats.org/officeDocument/2006/bibliography"/>
+  </ds:schemaRefs>
+</ds:datastoreItem>
+</file>
+
 <file path=docMetadata/LabelInfo.xml><?xml version="1.0" encoding="utf-8"?>
 <clbl:labelList xmlns:clbl="http://schemas.microsoft.com/office/2020/mipLabelMetadata">
   <clbl:label id="{05ea74a3-92c5-4c31-978a-925c3c799cd0}" enabled="0" method="" siteId="{05ea74a3-92c5-4c31-978a-925c3c799cd0}" removed="1"/>

</xml_diff>